<commit_message>
feat: SK Template Upload - complete implementation with tests
- Add sk_templates migration, SkTemplate model, SkTemplateService
- Add StoreSkTemplateRequest validation (docx, max 10MB, valid sk_type)
- Add SkTemplateController with full CRUD + activate + download endpoints
- Register routes in api.php with auth:sanctum and role:super_admin guards
- Add skTemplateApi to src/lib/api.ts
- Add useSkTemplate hook with TanStack Query + static fallback on 404
- Add SkTemplateManagementPage with upload form, grouped list, activate/delete
- Update SkGeneratorPage to use useSkTemplate hook
- Register /dashboard/sk-templates route (super_admin only)
- Add unit tests: SkTemplateServiceTest, SkTemplateControllerTest
- Add property-based tests: SkTemplatePropertyTest (Properties 1-11, 16)
- Add frontend unit tests: useSkTemplate.test.ts, SkTemplateManagementPage.test.tsx
- Add vitest jsdom config and test-setup.ts
</commit_message>
<xml_diff>
--- a/public/templates/sk-gtt-template.docx
+++ b/public/templates/sk-gtt-template.docx
@@ -5411,204 +5411,291 @@
         </w:rPr>
       </w:pPr>
     </w:p>
+    <w:tbl>
+      <w:tblPr>
+        <w:tblStyle w:val="TableGrid"/>
+        <w:tblW w:w="0" w:type="auto"/>
+        <w:tblBorders>
+          <w:top w:val="none" w:sz="0" w:space="0" w:color="auto"/>
+          <w:left w:val="none" w:sz="0" w:space="0" w:color="auto"/>
+          <w:bottom w:val="none" w:sz="0" w:space="0" w:color="auto"/>
+          <w:right w:val="none" w:sz="0" w:space="0" w:color="auto"/>
+          <w:insideH w:val="none" w:sz="0" w:space="0" w:color="auto"/>
+          <w:insideV w:val="none" w:sz="0" w:space="0" w:color="auto"/>
+        </w:tblBorders>
+        <w:tblLook w:val="04A0" w:firstRow="1" w:lastRow="0" w:firstColumn="1" w:lastColumn="0" w:noHBand="0" w:noVBand="1"/>
+      </w:tblPr>
+      <w:tblGrid>
+        <w:gridCol w:w="5378"/>
+        <w:gridCol w:w="5378"/>
+      </w:tblGrid>
+      <w:tr>
+        <w:tc>
+          <w:tcPr>
+            <w:tcW w:w="5378" w:type="dxa"/>
+          </w:tcPr>
+          <w:p>
+            <w:pPr>
+              <w:spacing w:after="0" w:line="240" w:lineRule="auto"/>
+              <w:rPr>
+                <w:rFonts w:ascii="Arial Narrow" w:hAnsi="Arial Narrow" w:cs="Times New Roman"/>
+                <w:sz w:val="20"/>
+                <w:szCs w:val="20"/>
+              </w:rPr>
+            </w:pPr>
+            <w:r>
+              <w:rPr>
+                <w:rFonts w:ascii="Arial Narrow" w:hAnsi="Arial Narrow" w:cs="Times New Roman"/>
+                <w:sz w:val="20"/>
+                <w:szCs w:val="20"/>
+              </w:rPr>
+              <w:t>Tembusan dikrim Kepada Yth.</w:t>
+            </w:r>
+          </w:p>
+          <w:p>
+            <w:pPr>
+              <w:pStyle w:val="ListParagraph"/>
+              <w:numPr>
+                <w:ilvl w:val="0"/>
+                <w:numId w:val="1"/>
+              </w:numPr>
+              <w:spacing w:after="0" w:line="240" w:lineRule="auto"/>
+              <w:rPr>
+                <w:rFonts w:ascii="Arial Narrow" w:hAnsi="Arial Narrow" w:cs="Times New Roman"/>
+                <w:sz w:val="20"/>
+                <w:szCs w:val="20"/>
+              </w:rPr>
+            </w:pPr>
+            <w:r>
+              <w:rPr>
+                <w:rFonts w:ascii="Arial Narrow" w:hAnsi="Arial Narrow" w:cs="Times New Roman"/>
+                <w:sz w:val="20"/>
+                <w:szCs w:val="20"/>
+                <w:lang w:val="en-US"/>
+              </w:rPr>
+              <w:t xml:space="preserve">LP </w:t>
+            </w:r>
+            <w:proofErr w:type="spellStart"/>
+            <w:r>
+              <w:rPr>
+                <w:rFonts w:ascii="Arial Narrow" w:hAnsi="Arial Narrow" w:cs="Times New Roman"/>
+                <w:sz w:val="20"/>
+                <w:szCs w:val="20"/>
+                <w:lang w:val="en-US"/>
+              </w:rPr>
+              <w:t>Ma’arif</w:t>
+            </w:r>
+            <w:proofErr w:type="spellEnd"/>
+            <w:r>
+              <w:rPr>
+                <w:rFonts w:ascii="Arial Narrow" w:hAnsi="Arial Narrow" w:cs="Times New Roman"/>
+                <w:sz w:val="20"/>
+                <w:szCs w:val="20"/>
+                <w:lang w:val="en-US"/>
+              </w:rPr>
+              <w:t xml:space="preserve"> NU PWNU</w:t>
+            </w:r>
+            <w:r>
+              <w:rPr>
+                <w:rFonts w:ascii="Arial Narrow" w:hAnsi="Arial Narrow" w:cs="Times New Roman"/>
+                <w:sz w:val="20"/>
+                <w:szCs w:val="20"/>
+              </w:rPr>
+              <w:t xml:space="preserve"> Jawa Tengah </w:t>
+            </w:r>
+          </w:p>
+          <w:p>
+            <w:pPr>
+              <w:pStyle w:val="ListParagraph"/>
+              <w:numPr>
+                <w:ilvl w:val="0"/>
+                <w:numId w:val="1"/>
+              </w:numPr>
+              <w:spacing w:after="0" w:line="240" w:lineRule="auto"/>
+              <w:rPr>
+                <w:rFonts w:ascii="Arial Narrow" w:hAnsi="Arial Narrow" w:cs="Times New Roman"/>
+                <w:sz w:val="20"/>
+                <w:szCs w:val="20"/>
+              </w:rPr>
+            </w:pPr>
+            <w:r>
+              <w:rPr>
+                <w:rFonts w:ascii="Arial Narrow" w:hAnsi="Arial Narrow" w:cs="Times New Roman"/>
+                <w:sz w:val="20"/>
+                <w:szCs w:val="20"/>
+              </w:rPr>
+              <w:t>Pengurus Cabang NU Kabupaten Cilacap</w:t>
+            </w:r>
+          </w:p>
+          <w:p>
+            <w:pPr>
+              <w:pStyle w:val="ListParagraph"/>
+              <w:numPr>
+                <w:ilvl w:val="0"/>
+                <w:numId w:val="1"/>
+              </w:numPr>
+              <w:spacing w:after="0" w:line="240" w:lineRule="auto"/>
+              <w:rPr>
+                <w:rFonts w:ascii="Arial Narrow" w:hAnsi="Arial Narrow" w:cs="Times New Roman"/>
+                <w:noProof/>
+                <w:sz w:val="20"/>
+                <w:szCs w:val="20"/>
+              </w:rPr>
+            </w:pPr>
+            <w:r>
+              <w:rPr>
+                <w:rFonts w:ascii="Arial Narrow" w:hAnsi="Arial Narrow" w:cs="Times New Roman"/>
+                <w:sz w:val="20"/>
+                <w:szCs w:val="20"/>
+              </w:rPr>
+              <w:t xml:space="preserve">Perwakilan </w:t>
+            </w:r>
+            <w:r>
+              <w:rPr>
+                <w:rFonts w:ascii="Arial Narrow" w:hAnsi="Arial Narrow" w:cs="Times New Roman"/>
+                <w:sz w:val="20"/>
+                <w:szCs w:val="20"/>
+              </w:rPr>
+              <w:t>MWC</w:t>
+            </w:r>
+            <w:r>
+              <w:rPr>
+                <w:rFonts w:ascii="Arial Narrow" w:hAnsi="Arial Narrow" w:cs="Times New Roman"/>
+                <w:sz w:val="20"/>
+                <w:szCs w:val="20"/>
+              </w:rPr>
+              <w:t xml:space="preserve"> LP Ma’arif </w:t>
+            </w:r>
+            <w:r>
+              <w:rPr>
+                <w:rFonts w:ascii="Arial Narrow" w:hAnsi="Arial Narrow" w:cs="Times New Roman"/>
+                <w:sz w:val="20"/>
+                <w:szCs w:val="20"/>
+              </w:rPr>
+              <w:t xml:space="preserve">NU {KECAMATAN}                                                                                                    </w:t>
+            </w:r>
+          </w:p>
+          <w:p>
+            <w:pPr>
+              <w:pStyle w:val="ListParagraph"/>
+              <w:numPr>
+                <w:ilvl w:val="0"/>
+                <w:numId w:val="1"/>
+              </w:numPr>
+              <w:spacing w:after="0" w:line="240" w:lineRule="auto"/>
+              <w:rPr>
+                <w:rFonts w:ascii="Arial Narrow" w:hAnsi="Arial Narrow" w:cs="Times New Roman"/>
+                <w:noProof/>
+                <w:sz w:val="20"/>
+                <w:szCs w:val="20"/>
+              </w:rPr>
+            </w:pPr>
+            <w:r>
+              <w:rPr>
+                <w:rFonts w:ascii="Arial Narrow" w:hAnsi="Arial Narrow" w:cs="Times New Roman"/>
+                <w:sz w:val="20"/>
+                <w:szCs w:val="20"/>
+              </w:rPr>
+              <w:t xml:space="preserve">Kepala </w:t>
+            </w:r>
+            <w:r>
+              <w:rPr>
+                <w:rFonts w:ascii="Arial Narrow" w:hAnsi="Arial Narrow" w:cs="Times New Roman"/>
+                <w:sz w:val="20"/>
+                <w:szCs w:val="20"/>
+              </w:rPr>
+              <w:t>{UNIT KERJA}</w:t>
+            </w:r>
+          </w:p>
+          <w:p>
+            <w:pPr>
+              <w:pStyle w:val="ListParagraph"/>
+              <w:numPr>
+                <w:ilvl w:val="0"/>
+                <w:numId w:val="1"/>
+              </w:numPr>
+              <w:spacing w:after="0" w:line="240" w:lineRule="auto"/>
+              <w:rPr>
+                <w:rFonts w:ascii="Arial Narrow" w:hAnsi="Arial Narrow" w:cs="Times New Roman"/>
+                <w:noProof/>
+                <w:sz w:val="20"/>
+                <w:szCs w:val="20"/>
+              </w:rPr>
+            </w:pPr>
+            <w:r>
+              <w:rPr>
+                <w:rFonts w:ascii="Arial Narrow" w:hAnsi="Arial Narrow" w:cs="Times New Roman"/>
+                <w:sz w:val="20"/>
+                <w:szCs w:val="20"/>
+              </w:rPr>
+              <w:t>BP3MNU</w:t>
+            </w:r>
+            <w:r>
+              <w:rPr>
+                <w:rFonts w:ascii="Arial Narrow" w:hAnsi="Arial Narrow" w:cs="Times New Roman"/>
+                <w:sz w:val="20"/>
+                <w:szCs w:val="20"/>
+              </w:rPr>
+              <w:t xml:space="preserve"> </w:t>
+            </w:r>
+            <w:r>
+              <w:rPr>
+                <w:rFonts w:ascii="Arial Narrow" w:hAnsi="Arial Narrow" w:cs="Times New Roman"/>
+                <w:sz w:val="20"/>
+                <w:szCs w:val="20"/>
+              </w:rPr>
+              <w:t>{UNIT KERJA}</w:t>
+            </w:r>
+          </w:p>
+          <w:p>
+            <w:pPr>
+              <w:pStyle w:val="ListParagraph"/>
+              <w:numPr>
+                <w:ilvl w:val="0"/>
+                <w:numId w:val="1"/>
+              </w:numPr>
+              <w:spacing w:after="0" w:line="240" w:lineRule="auto"/>
+              <w:rPr>
+                <w:rFonts w:ascii="Arial Narrow" w:hAnsi="Arial Narrow"/>
+                <w:sz w:val="20"/>
+                <w:szCs w:val="20"/>
+              </w:rPr>
+            </w:pPr>
+            <w:r>
+              <w:rPr>
+                <w:rFonts w:ascii="Arial Narrow" w:hAnsi="Arial Narrow"/>
+                <w:sz w:val="20"/>
+                <w:szCs w:val="20"/>
+              </w:rPr>
+              <w:t>Arsip</w:t>
+            </w:r>
+          </w:p>
+        </w:tc>
+        <w:tc>
+          <w:tcPr>
+            <w:tcW w:w="5378" w:type="dxa"/>
+          </w:tcPr>
+          <w:p>
+            <w:pPr>
+              <w:spacing w:after="0" w:line="240" w:lineRule="auto"/>
+              <w:jc w:val="right"/>
+              <w:rPr>
+                <w:rFonts w:ascii="Arial Narrow" w:hAnsi="Arial Narrow" w:cs="Times New Roman"/>
+                <w:sz w:val="20"/>
+                <w:szCs w:val="20"/>
+              </w:rPr>
+            </w:pPr>
+            <w:r>
+              <w:t>{%qrcode}</w:t>
+            </w:r>
+          </w:p>
+        </w:tc>
+      </w:tr>
+    </w:tbl>
     <w:p>
       <w:pPr>
         <w:spacing w:after="0" w:line="240" w:lineRule="auto"/>
-        <w:rPr>
-          <w:rFonts w:ascii="Arial Narrow" w:hAnsi="Arial Narrow" w:cs="Times New Roman"/>
-          <w:sz w:val="20"/>
-          <w:szCs w:val="20"/>
-        </w:rPr>
       </w:pPr>
-      <w:r>
-        <w:rPr>
-          <w:rFonts w:ascii="Arial Narrow" w:hAnsi="Arial Narrow" w:cs="Times New Roman"/>
-          <w:sz w:val="20"/>
-          <w:szCs w:val="20"/>
-        </w:rPr>
-        <w:t>Tembusan dikrim Kepada Yth.</w:t>
-      </w:r>
-    </w:p>
-    <w:p>
-      <w:pPr>
-        <w:pStyle w:val="ListParagraph"/>
-        <w:numPr>
-          <w:ilvl w:val="0"/>
-          <w:numId w:val="1"/>
-        </w:numPr>
-        <w:spacing w:after="0" w:line="240" w:lineRule="auto"/>
-        <w:rPr>
-          <w:rFonts w:ascii="Arial Narrow" w:hAnsi="Arial Narrow" w:cs="Times New Roman"/>
-          <w:sz w:val="20"/>
-          <w:szCs w:val="20"/>
-        </w:rPr>
-      </w:pPr>
-      <w:r>
-        <w:rPr>
-          <w:rFonts w:ascii="Arial Narrow" w:hAnsi="Arial Narrow" w:cs="Times New Roman"/>
-          <w:sz w:val="20"/>
-          <w:szCs w:val="20"/>
-          <w:lang w:val="en-US"/>
-        </w:rPr>
-        <w:t>LP Ma’arif NU PWNU</w:t>
-      </w:r>
-      <w:r>
-        <w:rPr>
-          <w:rFonts w:ascii="Arial Narrow" w:hAnsi="Arial Narrow" w:cs="Times New Roman"/>
-          <w:sz w:val="20"/>
-          <w:szCs w:val="20"/>
-        </w:rPr>
-        <w:t xml:space="preserve"> Jawa Tengah </w:t>
-      </w:r>
-    </w:p>
-    <w:p>
-      <w:pPr>
-        <w:pStyle w:val="ListParagraph"/>
-        <w:numPr>
-          <w:ilvl w:val="0"/>
-          <w:numId w:val="1"/>
-        </w:numPr>
-        <w:spacing w:after="0" w:line="240" w:lineRule="auto"/>
-        <w:rPr>
-          <w:rFonts w:ascii="Arial Narrow" w:hAnsi="Arial Narrow" w:cs="Times New Roman"/>
-          <w:sz w:val="20"/>
-          <w:szCs w:val="20"/>
-        </w:rPr>
-      </w:pPr>
-      <w:r>
-        <w:rPr>
-          <w:rFonts w:ascii="Arial Narrow" w:hAnsi="Arial Narrow" w:cs="Times New Roman"/>
-          <w:sz w:val="20"/>
-          <w:szCs w:val="20"/>
-        </w:rPr>
-        <w:t>Pengurus Cabang NU Kabupaten Cilacap</w:t>
-      </w:r>
-    </w:p>
-    <w:p>
-      <w:pPr>
-        <w:pStyle w:val="ListParagraph"/>
-        <w:numPr>
-          <w:ilvl w:val="0"/>
-          <w:numId w:val="1"/>
-        </w:numPr>
-        <w:spacing w:after="0" w:line="240" w:lineRule="auto"/>
-        <w:rPr>
-          <w:rFonts w:ascii="Arial Narrow" w:hAnsi="Arial Narrow" w:cs="Times New Roman"/>
-          <w:noProof/>
-          <w:sz w:val="20"/>
-          <w:szCs w:val="20"/>
-        </w:rPr>
-      </w:pPr>
-      <w:r>
-        <w:rPr>
-          <w:rFonts w:ascii="Arial Narrow" w:hAnsi="Arial Narrow" w:cs="Times New Roman"/>
-          <w:sz w:val="20"/>
-          <w:szCs w:val="20"/>
-        </w:rPr>
-        <w:t xml:space="preserve">LP Ma’arif NU </w:t>
-      </w:r>
-      <w:r>
-        <w:rPr>
-          <w:rFonts w:ascii="Arial Narrow" w:hAnsi="Arial Narrow" w:cs="Times New Roman"/>
-          <w:sz w:val="20"/>
-          <w:szCs w:val="20"/>
-        </w:rPr>
-        <w:t xml:space="preserve">MWCNU </w:t>
-      </w:r>
-      <w:r>
-        <w:rPr>
-          <w:rFonts w:ascii="Arial Narrow" w:hAnsi="Arial Narrow" w:cs="Times New Roman"/>
-          <w:sz w:val="20"/>
-          <w:szCs w:val="20"/>
-          <w:lang w:val="en-US"/>
-        </w:rPr>
-        <w:fldChar w:fldCharType="begin"/>
-      </w:r>
-      <w:r>
-        <w:rPr>
-          <w:rFonts w:ascii="Arial Narrow" w:hAnsi="Arial Narrow" w:cs="Times New Roman"/>
-          <w:sz w:val="20"/>
-          <w:szCs w:val="20"/>
-        </w:rPr>
-        <w:instrText xml:space="preserve"> MERGEFIELD "KECAMATAN" </w:instrText>
-      </w:r>
-      <w:r>
-        <w:rPr>
-          <w:rFonts w:ascii="Arial Narrow" w:hAnsi="Arial Narrow" w:cs="Times New Roman"/>
-          <w:sz w:val="20"/>
-          <w:szCs w:val="20"/>
-          <w:lang w:val="en-US"/>
-        </w:rPr>
-        <w:fldChar w:fldCharType="separate"/>
-      </w:r>
-      <w:r>
-        <w:rPr>
-          <w:rFonts w:ascii="Arial Narrow" w:hAnsi="Arial Narrow" w:cs="Times New Roman"/>
-          <w:noProof/>
-          <w:sz w:val="20"/>
-          <w:szCs w:val="20"/>
-        </w:rPr>
-        <w:t>{KECAMATAN}</w:t>
-      </w:r>
-      <w:r>
-        <w:rPr>
-          <w:rFonts w:ascii="Arial Narrow" w:hAnsi="Arial Narrow" w:cs="Times New Roman"/>
-          <w:sz w:val="20"/>
-          <w:szCs w:val="20"/>
-          <w:lang w:val="en-US"/>
-        </w:rPr>
-        <w:fldChar w:fldCharType="end"/>
-      </w:r>
-    </w:p>
-    <w:p>
-      <w:pPr>
-        <w:pStyle w:val="ListParagraph"/>
-        <w:numPr>
-          <w:ilvl w:val="0"/>
-          <w:numId w:val="1"/>
-        </w:numPr>
-        <w:spacing w:after="0" w:line="240" w:lineRule="auto"/>
-        <w:rPr>
-          <w:rFonts w:ascii="Arial Narrow" w:hAnsi="Arial Narrow" w:cs="Times New Roman"/>
-          <w:noProof/>
-          <w:sz w:val="20"/>
-          <w:szCs w:val="20"/>
-        </w:rPr>
-      </w:pPr>
-      <w:r>
-        <w:rPr>
-          <w:rFonts w:ascii="Arial Narrow" w:hAnsi="Arial Narrow" w:cs="Times New Roman"/>
-          <w:sz w:val="20"/>
-          <w:szCs w:val="20"/>
-        </w:rPr>
-        <w:t xml:space="preserve">Kepala </w:t>
-      </w:r>
-      <w:r>
-        <w:rPr>
-          <w:rFonts w:ascii="Arial Narrow" w:hAnsi="Arial Narrow" w:cs="Times New Roman"/>
-          <w:sz w:val="20"/>
-          <w:szCs w:val="20"/>
-        </w:rPr>
-        <w:t>{UNIT KERJA}</w:t>
-      </w:r>
-    </w:p>
-    <w:p>
-      <w:pPr>
-        <w:pStyle w:val="ListParagraph"/>
-        <w:numPr>
-          <w:ilvl w:val="0"/>
-          <w:numId w:val="1"/>
-        </w:numPr>
-        <w:spacing w:after="0" w:line="240" w:lineRule="auto"/>
-      </w:pPr>
-      <w:r>
-        <w:rPr>
-          <w:rFonts w:ascii="Arial Narrow" w:hAnsi="Arial Narrow" w:cs="Times New Roman"/>
-          <w:sz w:val="20"/>
-          <w:szCs w:val="20"/>
-        </w:rPr>
-        <w:t>Arsip</w:t>
-      </w:r>
     </w:p>
     <w:sectPr>
       <w:headerReference w:type="default" r:id="rId10"/>
@@ -5816,6 +5903,7 @@
       </w:rPr>
       <w:t xml:space="preserve"> I/36 </w:t>
     </w:r>
+    <w:proofErr w:type="spellStart"/>
     <w:r>
       <w:rPr>
         <w:rFonts w:ascii="Arial Narrow" w:hAnsi="Arial Narrow"/>
@@ -5824,7 +5912,40 @@
         <w:szCs w:val="20"/>
         <w:lang w:val="en-US"/>
       </w:rPr>
-      <w:t>Kel.Sidanegara Kec. C</w:t>
+      <w:t>Kel.Sidanegara</w:t>
+    </w:r>
+    <w:proofErr w:type="spellEnd"/>
+    <w:r>
+      <w:rPr>
+        <w:rFonts w:ascii="Arial Narrow" w:hAnsi="Arial Narrow"/>
+        <w:color w:val="000000" w:themeColor="text1"/>
+        <w:sz w:val="20"/>
+        <w:szCs w:val="20"/>
+        <w:lang w:val="en-US"/>
+      </w:rPr>
+      <w:t xml:space="preserve"> </w:t>
+    </w:r>
+    <w:proofErr w:type="spellStart"/>
+    <w:r>
+      <w:rPr>
+        <w:rFonts w:ascii="Arial Narrow" w:hAnsi="Arial Narrow"/>
+        <w:color w:val="000000" w:themeColor="text1"/>
+        <w:sz w:val="20"/>
+        <w:szCs w:val="20"/>
+        <w:lang w:val="en-US"/>
+      </w:rPr>
+      <w:t>Kec</w:t>
+    </w:r>
+    <w:proofErr w:type="spellEnd"/>
+    <w:r>
+      <w:rPr>
+        <w:rFonts w:ascii="Arial Narrow" w:hAnsi="Arial Narrow"/>
+        <w:color w:val="000000" w:themeColor="text1"/>
+        <w:sz w:val="20"/>
+        <w:szCs w:val="20"/>
+        <w:lang w:val="en-US"/>
+      </w:rPr>
+      <w:t>. C</w:t>
     </w:r>
     <w:r>
       <w:rPr>
@@ -5843,7 +5964,29 @@
         <w:szCs w:val="20"/>
         <w:lang w:val="en-US"/>
       </w:rPr>
-      <w:t xml:space="preserve"> Tengah kab. Cilacap</w:t>
+      <w:t xml:space="preserve"> Tengah </w:t>
+    </w:r>
+    <w:proofErr w:type="spellStart"/>
+    <w:r>
+      <w:rPr>
+        <w:rFonts w:ascii="Arial Narrow" w:hAnsi="Arial Narrow"/>
+        <w:color w:val="000000" w:themeColor="text1"/>
+        <w:sz w:val="20"/>
+        <w:szCs w:val="20"/>
+        <w:lang w:val="en-US"/>
+      </w:rPr>
+      <w:t>kab</w:t>
+    </w:r>
+    <w:proofErr w:type="spellEnd"/>
+    <w:r>
+      <w:rPr>
+        <w:rFonts w:ascii="Arial Narrow" w:hAnsi="Arial Narrow"/>
+        <w:color w:val="000000" w:themeColor="text1"/>
+        <w:sz w:val="20"/>
+        <w:szCs w:val="20"/>
+        <w:lang w:val="en-US"/>
+      </w:rPr>
+      <w:t>. Cilacap</w:t>
     </w:r>
     <w:r>
       <w:rPr>
@@ -6123,7 +6266,51 @@
         <w:szCs w:val="20"/>
         <w:lang w:val="en-US"/>
       </w:rPr>
-      <w:t>P Ma’arif NU Cilacap               Ma’arif NU Cilacap</w:t>
+      <w:t xml:space="preserve">P </w:t>
+    </w:r>
+    <w:proofErr w:type="spellStart"/>
+    <w:r>
+      <w:rPr>
+        <w:rFonts w:ascii="Arial Narrow" w:hAnsi="Arial Narrow"/>
+        <w:color w:val="000000" w:themeColor="text1"/>
+        <w:sz w:val="20"/>
+        <w:szCs w:val="20"/>
+        <w:lang w:val="en-US"/>
+      </w:rPr>
+      <w:t>Ma’arif</w:t>
+    </w:r>
+    <w:proofErr w:type="spellEnd"/>
+    <w:r>
+      <w:rPr>
+        <w:rFonts w:ascii="Arial Narrow" w:hAnsi="Arial Narrow"/>
+        <w:color w:val="000000" w:themeColor="text1"/>
+        <w:sz w:val="20"/>
+        <w:szCs w:val="20"/>
+        <w:lang w:val="en-US"/>
+      </w:rPr>
+      <w:t xml:space="preserve"> NU Cilacap               </w:t>
+    </w:r>
+    <w:proofErr w:type="spellStart"/>
+    <w:r>
+      <w:rPr>
+        <w:rFonts w:ascii="Arial Narrow" w:hAnsi="Arial Narrow"/>
+        <w:color w:val="000000" w:themeColor="text1"/>
+        <w:sz w:val="20"/>
+        <w:szCs w:val="20"/>
+        <w:lang w:val="en-US"/>
+      </w:rPr>
+      <w:t>Ma’arif</w:t>
+    </w:r>
+    <w:proofErr w:type="spellEnd"/>
+    <w:r>
+      <w:rPr>
+        <w:rFonts w:ascii="Arial Narrow" w:hAnsi="Arial Narrow"/>
+        <w:color w:val="000000" w:themeColor="text1"/>
+        <w:sz w:val="20"/>
+        <w:szCs w:val="20"/>
+        <w:lang w:val="en-US"/>
+      </w:rPr>
+      <w:t xml:space="preserve"> NU Cilacap</w:t>
     </w:r>
   </w:p>
   <w:p>
@@ -6791,6 +6978,25 @@
       <w:lang w:val="id-ID"/>
     </w:rPr>
   </w:style>
+  <w:style w:type="table" w:styleId="TableGrid">
+    <w:name w:val="Table Grid"/>
+    <w:basedOn w:val="TableNormal"/>
+    <w:uiPriority w:val="39"/>
+    <w:rsid w:val="00D44945"/>
+    <w:pPr>
+      <w:spacing w:after="0" w:line="240" w:lineRule="auto"/>
+    </w:pPr>
+    <w:tblPr>
+      <w:tblBorders>
+        <w:top w:val="single" w:sz="4" w:space="0" w:color="auto"/>
+        <w:left w:val="single" w:sz="4" w:space="0" w:color="auto"/>
+        <w:bottom w:val="single" w:sz="4" w:space="0" w:color="auto"/>
+        <w:right w:val="single" w:sz="4" w:space="0" w:color="auto"/>
+        <w:insideH w:val="single" w:sz="4" w:space="0" w:color="auto"/>
+        <w:insideV w:val="single" w:sz="4" w:space="0" w:color="auto"/>
+      </w:tblBorders>
+    </w:tblPr>
+  </w:style>
 </w:styles>
 </file>
 

</xml_diff>

<commit_message>
feat: SK Nomor Periode — ganti {TANGGAL} dengan {PERIODE} masa kerja guru
- Tambah fungsi calculatePeriode (pure function, floor years dari TMT ke tanggal cetak)
- Unit tests (7) + property tests (4) untuk calculatePeriode
- Update default nomorFormat: {TANGGAL} → {PERIODE}
- Integrasikan calculatePeriode ke handleGenerate di SkGeneratorPage
- Tambah renderData[PERIODE] untuk docxtemplater
- Tambah tooltip/help text placeholder di UI
- Update template docx (sk-gty, sk-gtt, sk-tendik)
</commit_message>
<xml_diff>
--- a/public/templates/sk-gtt-template.docx
+++ b/public/templates/sk-gtt-template.docx
@@ -91,7 +91,27 @@
           <w:sz w:val="20"/>
           <w:szCs w:val="20"/>
         </w:rPr>
-        <w:t>NOMOR}/PC.L/A.II/H-34.B/24.29/{TANGGAL}/{BULAN}/{</w:t>
+        <w:t>NOMOR}/PC.L/A.II/H-34.B/24.29/{</w:t>
+      </w:r>
+      <w:r>
+        <w:rPr>
+          <w:rFonts w:ascii="Consolas" w:hAnsi="Consolas" w:cs="Times New Roman"/>
+          <w:b/>
+          <w:noProof/>
+          <w:sz w:val="20"/>
+          <w:szCs w:val="20"/>
+        </w:rPr>
+        <w:t>PERIODE</w:t>
+      </w:r>
+      <w:r>
+        <w:rPr>
+          <w:rFonts w:ascii="Consolas" w:hAnsi="Consolas" w:cs="Times New Roman"/>
+          <w:b/>
+          <w:noProof/>
+          <w:sz w:val="20"/>
+          <w:szCs w:val="20"/>
+        </w:rPr>
+        <w:t>}/{BULAN}/{</w:t>
       </w:r>
       <w:r>
         <w:rPr>

</xml_diff>

<commit_message>
Add Kiro steering guides for MinIO and Hostinger setup
</commit_message>
<xml_diff>
--- a/public/templates/sk-gtt-template.docx
+++ b/public/templates/sk-gtt-template.docx
@@ -49,15 +49,6 @@
       </w:r>
       <w:r>
         <w:rPr>
-          <w:rFonts w:ascii="Arial Narrow" w:hAnsi="Arial Narrow" w:cs="Times New Roman"/>
-          <w:b/>
-          <w:sz w:val="20"/>
-          <w:szCs w:val="20"/>
-        </w:rPr>
-        <w:t>{</w:t>
-      </w:r>
-      <w:r>
-        <w:rPr>
           <w:rFonts w:ascii="Consolas" w:hAnsi="Consolas" w:cs="Times New Roman"/>
           <w:b/>
           <w:sz w:val="20"/>
@@ -87,11 +78,20 @@
         <w:rPr>
           <w:rFonts w:ascii="Consolas" w:hAnsi="Consolas" w:cs="Times New Roman"/>
           <w:b/>
+          <w:sz w:val="20"/>
+          <w:szCs w:val="20"/>
+        </w:rPr>
+        <w:t>{NOMOR}</w:t>
+      </w:r>
+      <w:r>
+        <w:rPr>
+          <w:rFonts w:ascii="Consolas" w:hAnsi="Consolas" w:cs="Times New Roman"/>
+          <w:b/>
           <w:noProof/>
           <w:sz w:val="20"/>
           <w:szCs w:val="20"/>
         </w:rPr>
-        <w:t>NOMOR}/PC.L/A.II/H-34.B/24.29/{</w:t>
+        <w:t>/PC.L/A.II/H-34.B/24.29/{</w:t>
       </w:r>
       <w:r>
         <w:rPr>
@@ -5475,11 +5475,8 @@
           <w:p>
             <w:pPr>
               <w:pStyle w:val="ListParagraph"/>
-              <w:numPr>
-                <w:ilvl w:val="0"/>
-                <w:numId w:val="1"/>
-              </w:numPr>
-              <w:spacing w:after="0" w:line="240" w:lineRule="auto"/>
+              <w:spacing w:after="0" w:line="240" w:lineRule="auto"/>
+              <w:ind w:left="1080" w:hanging="371"/>
               <w:rPr>
                 <w:rFonts w:ascii="Arial Narrow" w:hAnsi="Arial Narrow" w:cs="Times New Roman"/>
                 <w:sz w:val="20"/>
@@ -5491,203 +5488,48 @@
                 <w:rFonts w:ascii="Arial Narrow" w:hAnsi="Arial Narrow" w:cs="Times New Roman"/>
                 <w:sz w:val="20"/>
                 <w:szCs w:val="20"/>
-                <w:lang w:val="en-US"/>
-              </w:rPr>
-              <w:t xml:space="preserve">LP </w:t>
-            </w:r>
-            <w:proofErr w:type="spellStart"/>
-            <w:r>
+              </w:rPr>
+              <w:t>{#tembusan}</w:t>
+            </w:r>
+          </w:p>
+          <w:p>
+            <w:pPr>
+              <w:pStyle w:val="ListParagraph"/>
+              <w:spacing w:after="0" w:line="240" w:lineRule="auto"/>
+              <w:ind w:left="1080" w:hanging="371"/>
               <w:rPr>
                 <w:rFonts w:ascii="Arial Narrow" w:hAnsi="Arial Narrow" w:cs="Times New Roman"/>
                 <w:sz w:val="20"/>
                 <w:szCs w:val="20"/>
-                <w:lang w:val="en-US"/>
-              </w:rPr>
-              <w:t>Ma’arif</w:t>
-            </w:r>
-            <w:proofErr w:type="spellEnd"/>
+              </w:rPr>
+            </w:pPr>
             <w:r>
               <w:rPr>
                 <w:rFonts w:ascii="Arial Narrow" w:hAnsi="Arial Narrow" w:cs="Times New Roman"/>
                 <w:sz w:val="20"/>
                 <w:szCs w:val="20"/>
-                <w:lang w:val="en-US"/>
-              </w:rPr>
-              <w:t xml:space="preserve"> NU PWNU</w:t>
-            </w:r>
+              </w:rPr>
+              <w:t>{nomor}. {isi}</w:t>
+            </w:r>
+          </w:p>
+          <w:p>
+            <w:pPr>
+              <w:pStyle w:val="ListParagraph"/>
+              <w:spacing w:after="0" w:line="240" w:lineRule="auto"/>
+              <w:ind w:left="1080" w:hanging="371"/>
+              <w:rPr>
+                <w:rFonts w:ascii="Arial Narrow" w:hAnsi="Arial Narrow"/>
+                <w:sz w:val="20"/>
+                <w:szCs w:val="20"/>
+              </w:rPr>
+            </w:pPr>
             <w:r>
               <w:rPr>
                 <w:rFonts w:ascii="Arial Narrow" w:hAnsi="Arial Narrow" w:cs="Times New Roman"/>
                 <w:sz w:val="20"/>
                 <w:szCs w:val="20"/>
               </w:rPr>
-              <w:t xml:space="preserve"> Jawa Tengah </w:t>
-            </w:r>
-          </w:p>
-          <w:p>
-            <w:pPr>
-              <w:pStyle w:val="ListParagraph"/>
-              <w:numPr>
-                <w:ilvl w:val="0"/>
-                <w:numId w:val="1"/>
-              </w:numPr>
-              <w:spacing w:after="0" w:line="240" w:lineRule="auto"/>
-              <w:rPr>
-                <w:rFonts w:ascii="Arial Narrow" w:hAnsi="Arial Narrow" w:cs="Times New Roman"/>
-                <w:sz w:val="20"/>
-                <w:szCs w:val="20"/>
-              </w:rPr>
-            </w:pPr>
-            <w:r>
-              <w:rPr>
-                <w:rFonts w:ascii="Arial Narrow" w:hAnsi="Arial Narrow" w:cs="Times New Roman"/>
-                <w:sz w:val="20"/>
-                <w:szCs w:val="20"/>
-              </w:rPr>
-              <w:t>Pengurus Cabang NU Kabupaten Cilacap</w:t>
-            </w:r>
-          </w:p>
-          <w:p>
-            <w:pPr>
-              <w:pStyle w:val="ListParagraph"/>
-              <w:numPr>
-                <w:ilvl w:val="0"/>
-                <w:numId w:val="1"/>
-              </w:numPr>
-              <w:spacing w:after="0" w:line="240" w:lineRule="auto"/>
-              <w:rPr>
-                <w:rFonts w:ascii="Arial Narrow" w:hAnsi="Arial Narrow" w:cs="Times New Roman"/>
-                <w:noProof/>
-                <w:sz w:val="20"/>
-                <w:szCs w:val="20"/>
-              </w:rPr>
-            </w:pPr>
-            <w:r>
-              <w:rPr>
-                <w:rFonts w:ascii="Arial Narrow" w:hAnsi="Arial Narrow" w:cs="Times New Roman"/>
-                <w:sz w:val="20"/>
-                <w:szCs w:val="20"/>
-              </w:rPr>
-              <w:t xml:space="preserve">Perwakilan </w:t>
-            </w:r>
-            <w:r>
-              <w:rPr>
-                <w:rFonts w:ascii="Arial Narrow" w:hAnsi="Arial Narrow" w:cs="Times New Roman"/>
-                <w:sz w:val="20"/>
-                <w:szCs w:val="20"/>
-              </w:rPr>
-              <w:t>MWC</w:t>
-            </w:r>
-            <w:r>
-              <w:rPr>
-                <w:rFonts w:ascii="Arial Narrow" w:hAnsi="Arial Narrow" w:cs="Times New Roman"/>
-                <w:sz w:val="20"/>
-                <w:szCs w:val="20"/>
-              </w:rPr>
-              <w:t xml:space="preserve"> LP Ma’arif </w:t>
-            </w:r>
-            <w:r>
-              <w:rPr>
-                <w:rFonts w:ascii="Arial Narrow" w:hAnsi="Arial Narrow" w:cs="Times New Roman"/>
-                <w:sz w:val="20"/>
-                <w:szCs w:val="20"/>
-              </w:rPr>
-              <w:t xml:space="preserve">NU {KECAMATAN}                                                                                                    </w:t>
-            </w:r>
-          </w:p>
-          <w:p>
-            <w:pPr>
-              <w:pStyle w:val="ListParagraph"/>
-              <w:numPr>
-                <w:ilvl w:val="0"/>
-                <w:numId w:val="1"/>
-              </w:numPr>
-              <w:spacing w:after="0" w:line="240" w:lineRule="auto"/>
-              <w:rPr>
-                <w:rFonts w:ascii="Arial Narrow" w:hAnsi="Arial Narrow" w:cs="Times New Roman"/>
-                <w:noProof/>
-                <w:sz w:val="20"/>
-                <w:szCs w:val="20"/>
-              </w:rPr>
-            </w:pPr>
-            <w:r>
-              <w:rPr>
-                <w:rFonts w:ascii="Arial Narrow" w:hAnsi="Arial Narrow" w:cs="Times New Roman"/>
-                <w:sz w:val="20"/>
-                <w:szCs w:val="20"/>
-              </w:rPr>
-              <w:t xml:space="preserve">Kepala </w:t>
-            </w:r>
-            <w:r>
-              <w:rPr>
-                <w:rFonts w:ascii="Arial Narrow" w:hAnsi="Arial Narrow" w:cs="Times New Roman"/>
-                <w:sz w:val="20"/>
-                <w:szCs w:val="20"/>
-              </w:rPr>
-              <w:t>{UNIT KERJA}</w:t>
-            </w:r>
-          </w:p>
-          <w:p>
-            <w:pPr>
-              <w:pStyle w:val="ListParagraph"/>
-              <w:numPr>
-                <w:ilvl w:val="0"/>
-                <w:numId w:val="1"/>
-              </w:numPr>
-              <w:spacing w:after="0" w:line="240" w:lineRule="auto"/>
-              <w:rPr>
-                <w:rFonts w:ascii="Arial Narrow" w:hAnsi="Arial Narrow" w:cs="Times New Roman"/>
-                <w:noProof/>
-                <w:sz w:val="20"/>
-                <w:szCs w:val="20"/>
-              </w:rPr>
-            </w:pPr>
-            <w:r>
-              <w:rPr>
-                <w:rFonts w:ascii="Arial Narrow" w:hAnsi="Arial Narrow" w:cs="Times New Roman"/>
-                <w:sz w:val="20"/>
-                <w:szCs w:val="20"/>
-              </w:rPr>
-              <w:t>BP3MNU</w:t>
-            </w:r>
-            <w:r>
-              <w:rPr>
-                <w:rFonts w:ascii="Arial Narrow" w:hAnsi="Arial Narrow" w:cs="Times New Roman"/>
-                <w:sz w:val="20"/>
-                <w:szCs w:val="20"/>
-              </w:rPr>
-              <w:t xml:space="preserve"> </w:t>
-            </w:r>
-            <w:r>
-              <w:rPr>
-                <w:rFonts w:ascii="Arial Narrow" w:hAnsi="Arial Narrow" w:cs="Times New Roman"/>
-                <w:sz w:val="20"/>
-                <w:szCs w:val="20"/>
-              </w:rPr>
-              <w:t>{UNIT KERJA}</w:t>
-            </w:r>
-          </w:p>
-          <w:p>
-            <w:pPr>
-              <w:pStyle w:val="ListParagraph"/>
-              <w:numPr>
-                <w:ilvl w:val="0"/>
-                <w:numId w:val="1"/>
-              </w:numPr>
-              <w:spacing w:after="0" w:line="240" w:lineRule="auto"/>
-              <w:rPr>
-                <w:rFonts w:ascii="Arial Narrow" w:hAnsi="Arial Narrow"/>
-                <w:sz w:val="20"/>
-                <w:szCs w:val="20"/>
-              </w:rPr>
-            </w:pPr>
-            <w:r>
-              <w:rPr>
-                <w:rFonts w:ascii="Arial Narrow" w:hAnsi="Arial Narrow"/>
-                <w:sz w:val="20"/>
-                <w:szCs w:val="20"/>
-              </w:rPr>
-              <w:t>Arsip</w:t>
+              <w:t>{/tembusan}</w:t>
             </w:r>
           </w:p>
         </w:tc>
@@ -5923,7 +5765,6 @@
       </w:rPr>
       <w:t xml:space="preserve"> I/36 </w:t>
     </w:r>
-    <w:proofErr w:type="spellStart"/>
     <w:r>
       <w:rPr>
         <w:rFonts w:ascii="Arial Narrow" w:hAnsi="Arial Narrow"/>
@@ -5932,40 +5773,7 @@
         <w:szCs w:val="20"/>
         <w:lang w:val="en-US"/>
       </w:rPr>
-      <w:t>Kel.Sidanegara</w:t>
-    </w:r>
-    <w:proofErr w:type="spellEnd"/>
-    <w:r>
-      <w:rPr>
-        <w:rFonts w:ascii="Arial Narrow" w:hAnsi="Arial Narrow"/>
-        <w:color w:val="000000" w:themeColor="text1"/>
-        <w:sz w:val="20"/>
-        <w:szCs w:val="20"/>
-        <w:lang w:val="en-US"/>
-      </w:rPr>
-      <w:t xml:space="preserve"> </w:t>
-    </w:r>
-    <w:proofErr w:type="spellStart"/>
-    <w:r>
-      <w:rPr>
-        <w:rFonts w:ascii="Arial Narrow" w:hAnsi="Arial Narrow"/>
-        <w:color w:val="000000" w:themeColor="text1"/>
-        <w:sz w:val="20"/>
-        <w:szCs w:val="20"/>
-        <w:lang w:val="en-US"/>
-      </w:rPr>
-      <w:t>Kec</w:t>
-    </w:r>
-    <w:proofErr w:type="spellEnd"/>
-    <w:r>
-      <w:rPr>
-        <w:rFonts w:ascii="Arial Narrow" w:hAnsi="Arial Narrow"/>
-        <w:color w:val="000000" w:themeColor="text1"/>
-        <w:sz w:val="20"/>
-        <w:szCs w:val="20"/>
-        <w:lang w:val="en-US"/>
-      </w:rPr>
-      <w:t>. C</w:t>
+      <w:t>Kel.Sidanegara Kec. C</w:t>
     </w:r>
     <w:r>
       <w:rPr>
@@ -5984,29 +5792,7 @@
         <w:szCs w:val="20"/>
         <w:lang w:val="en-US"/>
       </w:rPr>
-      <w:t xml:space="preserve"> Tengah </w:t>
-    </w:r>
-    <w:proofErr w:type="spellStart"/>
-    <w:r>
-      <w:rPr>
-        <w:rFonts w:ascii="Arial Narrow" w:hAnsi="Arial Narrow"/>
-        <w:color w:val="000000" w:themeColor="text1"/>
-        <w:sz w:val="20"/>
-        <w:szCs w:val="20"/>
-        <w:lang w:val="en-US"/>
-      </w:rPr>
-      <w:t>kab</w:t>
-    </w:r>
-    <w:proofErr w:type="spellEnd"/>
-    <w:r>
-      <w:rPr>
-        <w:rFonts w:ascii="Arial Narrow" w:hAnsi="Arial Narrow"/>
-        <w:color w:val="000000" w:themeColor="text1"/>
-        <w:sz w:val="20"/>
-        <w:szCs w:val="20"/>
-        <w:lang w:val="en-US"/>
-      </w:rPr>
-      <w:t>. Cilacap</w:t>
+      <w:t xml:space="preserve"> Tengah kab. Cilacap</w:t>
     </w:r>
     <w:r>
       <w:rPr>
@@ -6286,51 +6072,7 @@
         <w:szCs w:val="20"/>
         <w:lang w:val="en-US"/>
       </w:rPr>
-      <w:t xml:space="preserve">P </w:t>
-    </w:r>
-    <w:proofErr w:type="spellStart"/>
-    <w:r>
-      <w:rPr>
-        <w:rFonts w:ascii="Arial Narrow" w:hAnsi="Arial Narrow"/>
-        <w:color w:val="000000" w:themeColor="text1"/>
-        <w:sz w:val="20"/>
-        <w:szCs w:val="20"/>
-        <w:lang w:val="en-US"/>
-      </w:rPr>
-      <w:t>Ma’arif</w:t>
-    </w:r>
-    <w:proofErr w:type="spellEnd"/>
-    <w:r>
-      <w:rPr>
-        <w:rFonts w:ascii="Arial Narrow" w:hAnsi="Arial Narrow"/>
-        <w:color w:val="000000" w:themeColor="text1"/>
-        <w:sz w:val="20"/>
-        <w:szCs w:val="20"/>
-        <w:lang w:val="en-US"/>
-      </w:rPr>
-      <w:t xml:space="preserve"> NU Cilacap               </w:t>
-    </w:r>
-    <w:proofErr w:type="spellStart"/>
-    <w:r>
-      <w:rPr>
-        <w:rFonts w:ascii="Arial Narrow" w:hAnsi="Arial Narrow"/>
-        <w:color w:val="000000" w:themeColor="text1"/>
-        <w:sz w:val="20"/>
-        <w:szCs w:val="20"/>
-        <w:lang w:val="en-US"/>
-      </w:rPr>
-      <w:t>Ma’arif</w:t>
-    </w:r>
-    <w:proofErr w:type="spellEnd"/>
-    <w:r>
-      <w:rPr>
-        <w:rFonts w:ascii="Arial Narrow" w:hAnsi="Arial Narrow"/>
-        <w:color w:val="000000" w:themeColor="text1"/>
-        <w:sz w:val="20"/>
-        <w:szCs w:val="20"/>
-        <w:lang w:val="en-US"/>
-      </w:rPr>
-      <w:t xml:space="preserve"> NU Cilacap</w:t>
+      <w:t>P Ma’arif NU Cilacap               Ma’arif NU Cilacap</w:t>
     </w:r>
   </w:p>
   <w:p>

</xml_diff>

<commit_message>
Remove generate NIM button and reset password button from teacher list page
</commit_message>
<xml_diff>
--- a/public/templates/sk-gtt-template.docx
+++ b/public/templates/sk-gtt-template.docx
@@ -5446,13 +5446,13 @@
         <w:tblLook w:val="04A0" w:firstRow="1" w:lastRow="0" w:firstColumn="1" w:lastColumn="0" w:noHBand="0" w:noVBand="1"/>
       </w:tblPr>
       <w:tblGrid>
-        <w:gridCol w:w="5378"/>
-        <w:gridCol w:w="5378"/>
+        <w:gridCol w:w="7054"/>
+        <w:gridCol w:w="3702"/>
       </w:tblGrid>
       <w:tr>
         <w:tc>
           <w:tcPr>
-            <w:tcW w:w="5378" w:type="dxa"/>
+            <w:tcW w:w="7054" w:type="dxa"/>
           </w:tcPr>
           <w:p>
             <w:pPr>
@@ -5476,7 +5476,7 @@
             <w:pPr>
               <w:pStyle w:val="ListParagraph"/>
               <w:spacing w:after="0" w:line="240" w:lineRule="auto"/>
-              <w:ind w:left="1080" w:hanging="371"/>
+              <w:ind w:left="709"/>
               <w:rPr>
                 <w:rFonts w:ascii="Arial Narrow" w:hAnsi="Arial Narrow" w:cs="Times New Roman"/>
                 <w:sz w:val="20"/>
@@ -5496,7 +5496,7 @@
             <w:pPr>
               <w:pStyle w:val="ListParagraph"/>
               <w:spacing w:after="0" w:line="240" w:lineRule="auto"/>
-              <w:ind w:left="1080" w:hanging="371"/>
+              <w:ind w:left="709"/>
               <w:rPr>
                 <w:rFonts w:ascii="Arial Narrow" w:hAnsi="Arial Narrow" w:cs="Times New Roman"/>
                 <w:sz w:val="20"/>
@@ -5516,7 +5516,7 @@
             <w:pPr>
               <w:pStyle w:val="ListParagraph"/>
               <w:spacing w:after="0" w:line="240" w:lineRule="auto"/>
-              <w:ind w:left="1080" w:hanging="371"/>
+              <w:ind w:left="709"/>
               <w:rPr>
                 <w:rFonts w:ascii="Arial Narrow" w:hAnsi="Arial Narrow"/>
                 <w:sz w:val="20"/>
@@ -5535,7 +5535,7 @@
         </w:tc>
         <w:tc>
           <w:tcPr>
-            <w:tcW w:w="5378" w:type="dxa"/>
+            <w:tcW w:w="3702" w:type="dxa"/>
           </w:tcPr>
           <w:p>
             <w:pPr>
@@ -5765,6 +5765,7 @@
       </w:rPr>
       <w:t xml:space="preserve"> I/36 </w:t>
     </w:r>
+    <w:proofErr w:type="spellStart"/>
     <w:r>
       <w:rPr>
         <w:rFonts w:ascii="Arial Narrow" w:hAnsi="Arial Narrow"/>
@@ -5773,7 +5774,40 @@
         <w:szCs w:val="20"/>
         <w:lang w:val="en-US"/>
       </w:rPr>
-      <w:t>Kel.Sidanegara Kec. C</w:t>
+      <w:t>Kel.Sidanegara</w:t>
+    </w:r>
+    <w:proofErr w:type="spellEnd"/>
+    <w:r>
+      <w:rPr>
+        <w:rFonts w:ascii="Arial Narrow" w:hAnsi="Arial Narrow"/>
+        <w:color w:val="000000" w:themeColor="text1"/>
+        <w:sz w:val="20"/>
+        <w:szCs w:val="20"/>
+        <w:lang w:val="en-US"/>
+      </w:rPr>
+      <w:t xml:space="preserve"> </w:t>
+    </w:r>
+    <w:proofErr w:type="spellStart"/>
+    <w:r>
+      <w:rPr>
+        <w:rFonts w:ascii="Arial Narrow" w:hAnsi="Arial Narrow"/>
+        <w:color w:val="000000" w:themeColor="text1"/>
+        <w:sz w:val="20"/>
+        <w:szCs w:val="20"/>
+        <w:lang w:val="en-US"/>
+      </w:rPr>
+      <w:t>Kec</w:t>
+    </w:r>
+    <w:proofErr w:type="spellEnd"/>
+    <w:r>
+      <w:rPr>
+        <w:rFonts w:ascii="Arial Narrow" w:hAnsi="Arial Narrow"/>
+        <w:color w:val="000000" w:themeColor="text1"/>
+        <w:sz w:val="20"/>
+        <w:szCs w:val="20"/>
+        <w:lang w:val="en-US"/>
+      </w:rPr>
+      <w:t>. C</w:t>
     </w:r>
     <w:r>
       <w:rPr>
@@ -5792,7 +5826,29 @@
         <w:szCs w:val="20"/>
         <w:lang w:val="en-US"/>
       </w:rPr>
-      <w:t xml:space="preserve"> Tengah kab. Cilacap</w:t>
+      <w:t xml:space="preserve"> Tengah </w:t>
+    </w:r>
+    <w:proofErr w:type="spellStart"/>
+    <w:r>
+      <w:rPr>
+        <w:rFonts w:ascii="Arial Narrow" w:hAnsi="Arial Narrow"/>
+        <w:color w:val="000000" w:themeColor="text1"/>
+        <w:sz w:val="20"/>
+        <w:szCs w:val="20"/>
+        <w:lang w:val="en-US"/>
+      </w:rPr>
+      <w:t>kab</w:t>
+    </w:r>
+    <w:proofErr w:type="spellEnd"/>
+    <w:r>
+      <w:rPr>
+        <w:rFonts w:ascii="Arial Narrow" w:hAnsi="Arial Narrow"/>
+        <w:color w:val="000000" w:themeColor="text1"/>
+        <w:sz w:val="20"/>
+        <w:szCs w:val="20"/>
+        <w:lang w:val="en-US"/>
+      </w:rPr>
+      <w:t>. Cilacap</w:t>
     </w:r>
     <w:r>
       <w:rPr>
@@ -6072,7 +6128,51 @@
         <w:szCs w:val="20"/>
         <w:lang w:val="en-US"/>
       </w:rPr>
-      <w:t>P Ma’arif NU Cilacap               Ma’arif NU Cilacap</w:t>
+      <w:t xml:space="preserve">P </w:t>
+    </w:r>
+    <w:proofErr w:type="spellStart"/>
+    <w:r>
+      <w:rPr>
+        <w:rFonts w:ascii="Arial Narrow" w:hAnsi="Arial Narrow"/>
+        <w:color w:val="000000" w:themeColor="text1"/>
+        <w:sz w:val="20"/>
+        <w:szCs w:val="20"/>
+        <w:lang w:val="en-US"/>
+      </w:rPr>
+      <w:t>Ma’arif</w:t>
+    </w:r>
+    <w:proofErr w:type="spellEnd"/>
+    <w:r>
+      <w:rPr>
+        <w:rFonts w:ascii="Arial Narrow" w:hAnsi="Arial Narrow"/>
+        <w:color w:val="000000" w:themeColor="text1"/>
+        <w:sz w:val="20"/>
+        <w:szCs w:val="20"/>
+        <w:lang w:val="en-US"/>
+      </w:rPr>
+      <w:t xml:space="preserve"> NU Cilacap               </w:t>
+    </w:r>
+    <w:proofErr w:type="spellStart"/>
+    <w:r>
+      <w:rPr>
+        <w:rFonts w:ascii="Arial Narrow" w:hAnsi="Arial Narrow"/>
+        <w:color w:val="000000" w:themeColor="text1"/>
+        <w:sz w:val="20"/>
+        <w:szCs w:val="20"/>
+        <w:lang w:val="en-US"/>
+      </w:rPr>
+      <w:t>Ma’arif</w:t>
+    </w:r>
+    <w:proofErr w:type="spellEnd"/>
+    <w:r>
+      <w:rPr>
+        <w:rFonts w:ascii="Arial Narrow" w:hAnsi="Arial Narrow"/>
+        <w:color w:val="000000" w:themeColor="text1"/>
+        <w:sz w:val="20"/>
+        <w:szCs w:val="20"/>
+        <w:lang w:val="en-US"/>
+      </w:rPr>
+      <w:t xml:space="preserve"> NU Cilacap</w:t>
     </w:r>
   </w:p>
   <w:p>

</xml_diff>

<commit_message>
fix: improve degree normalization logic, disable docker healthcheck for queue/scheduler, update SK templates
</commit_message>
<xml_diff>
--- a/public/templates/sk-gtt-template.docx
+++ b/public/templates/sk-gtt-template.docx
@@ -111,7 +111,27 @@
           <w:sz w:val="20"/>
           <w:szCs w:val="20"/>
         </w:rPr>
-        <w:t>}/{BULAN}/{</w:t>
+        <w:t>}/</w:t>
+      </w:r>
+      <w:r>
+        <w:rPr>
+          <w:rFonts w:ascii="Consolas" w:hAnsi="Consolas" w:cs="Times New Roman"/>
+          <w:b/>
+          <w:noProof/>
+          <w:sz w:val="20"/>
+          <w:szCs w:val="20"/>
+        </w:rPr>
+        <w:t>7</w:t>
+      </w:r>
+      <w:r>
+        <w:rPr>
+          <w:rFonts w:ascii="Consolas" w:hAnsi="Consolas" w:cs="Times New Roman"/>
+          <w:b/>
+          <w:noProof/>
+          <w:sz w:val="20"/>
+          <w:szCs w:val="20"/>
+        </w:rPr>
+        <w:t>/{</w:t>
       </w:r>
       <w:r>
         <w:rPr>
@@ -5765,7 +5785,6 @@
       </w:rPr>
       <w:t xml:space="preserve"> I/36 </w:t>
     </w:r>
-    <w:proofErr w:type="spellStart"/>
     <w:r>
       <w:rPr>
         <w:rFonts w:ascii="Arial Narrow" w:hAnsi="Arial Narrow"/>
@@ -5774,40 +5793,7 @@
         <w:szCs w:val="20"/>
         <w:lang w:val="en-US"/>
       </w:rPr>
-      <w:t>Kel.Sidanegara</w:t>
-    </w:r>
-    <w:proofErr w:type="spellEnd"/>
-    <w:r>
-      <w:rPr>
-        <w:rFonts w:ascii="Arial Narrow" w:hAnsi="Arial Narrow"/>
-        <w:color w:val="000000" w:themeColor="text1"/>
-        <w:sz w:val="20"/>
-        <w:szCs w:val="20"/>
-        <w:lang w:val="en-US"/>
-      </w:rPr>
-      <w:t xml:space="preserve"> </w:t>
-    </w:r>
-    <w:proofErr w:type="spellStart"/>
-    <w:r>
-      <w:rPr>
-        <w:rFonts w:ascii="Arial Narrow" w:hAnsi="Arial Narrow"/>
-        <w:color w:val="000000" w:themeColor="text1"/>
-        <w:sz w:val="20"/>
-        <w:szCs w:val="20"/>
-        <w:lang w:val="en-US"/>
-      </w:rPr>
-      <w:t>Kec</w:t>
-    </w:r>
-    <w:proofErr w:type="spellEnd"/>
-    <w:r>
-      <w:rPr>
-        <w:rFonts w:ascii="Arial Narrow" w:hAnsi="Arial Narrow"/>
-        <w:color w:val="000000" w:themeColor="text1"/>
-        <w:sz w:val="20"/>
-        <w:szCs w:val="20"/>
-        <w:lang w:val="en-US"/>
-      </w:rPr>
-      <w:t>. C</w:t>
+      <w:t>Kel.Sidanegara Kec. C</w:t>
     </w:r>
     <w:r>
       <w:rPr>
@@ -5826,29 +5812,7 @@
         <w:szCs w:val="20"/>
         <w:lang w:val="en-US"/>
       </w:rPr>
-      <w:t xml:space="preserve"> Tengah </w:t>
-    </w:r>
-    <w:proofErr w:type="spellStart"/>
-    <w:r>
-      <w:rPr>
-        <w:rFonts w:ascii="Arial Narrow" w:hAnsi="Arial Narrow"/>
-        <w:color w:val="000000" w:themeColor="text1"/>
-        <w:sz w:val="20"/>
-        <w:szCs w:val="20"/>
-        <w:lang w:val="en-US"/>
-      </w:rPr>
-      <w:t>kab</w:t>
-    </w:r>
-    <w:proofErr w:type="spellEnd"/>
-    <w:r>
-      <w:rPr>
-        <w:rFonts w:ascii="Arial Narrow" w:hAnsi="Arial Narrow"/>
-        <w:color w:val="000000" w:themeColor="text1"/>
-        <w:sz w:val="20"/>
-        <w:szCs w:val="20"/>
-        <w:lang w:val="en-US"/>
-      </w:rPr>
-      <w:t>. Cilacap</w:t>
+      <w:t xml:space="preserve"> Tengah kab. Cilacap</w:t>
     </w:r>
     <w:r>
       <w:rPr>
@@ -6128,51 +6092,7 @@
         <w:szCs w:val="20"/>
         <w:lang w:val="en-US"/>
       </w:rPr>
-      <w:t xml:space="preserve">P </w:t>
-    </w:r>
-    <w:proofErr w:type="spellStart"/>
-    <w:r>
-      <w:rPr>
-        <w:rFonts w:ascii="Arial Narrow" w:hAnsi="Arial Narrow"/>
-        <w:color w:val="000000" w:themeColor="text1"/>
-        <w:sz w:val="20"/>
-        <w:szCs w:val="20"/>
-        <w:lang w:val="en-US"/>
-      </w:rPr>
-      <w:t>Ma’arif</w:t>
-    </w:r>
-    <w:proofErr w:type="spellEnd"/>
-    <w:r>
-      <w:rPr>
-        <w:rFonts w:ascii="Arial Narrow" w:hAnsi="Arial Narrow"/>
-        <w:color w:val="000000" w:themeColor="text1"/>
-        <w:sz w:val="20"/>
-        <w:szCs w:val="20"/>
-        <w:lang w:val="en-US"/>
-      </w:rPr>
-      <w:t xml:space="preserve"> NU Cilacap               </w:t>
-    </w:r>
-    <w:proofErr w:type="spellStart"/>
-    <w:r>
-      <w:rPr>
-        <w:rFonts w:ascii="Arial Narrow" w:hAnsi="Arial Narrow"/>
-        <w:color w:val="000000" w:themeColor="text1"/>
-        <w:sz w:val="20"/>
-        <w:szCs w:val="20"/>
-        <w:lang w:val="en-US"/>
-      </w:rPr>
-      <w:t>Ma’arif</w:t>
-    </w:r>
-    <w:proofErr w:type="spellEnd"/>
-    <w:r>
-      <w:rPr>
-        <w:rFonts w:ascii="Arial Narrow" w:hAnsi="Arial Narrow"/>
-        <w:color w:val="000000" w:themeColor="text1"/>
-        <w:sz w:val="20"/>
-        <w:szCs w:val="20"/>
-        <w:lang w:val="en-US"/>
-      </w:rPr>
-      <w:t xml:space="preserve"> NU Cilacap</w:t>
+      <w:t>P Ma’arif NU Cilacap               Ma’arif NU Cilacap</w:t>
     </w:r>
   </w:p>
   <w:p>

</xml_diff>

<commit_message>
Fix staff scanner GPS logic, add staff auto ID, fix degree normalization
</commit_message>
<xml_diff>
--- a/public/templates/sk-gtt-template.docx
+++ b/public/templates/sk-gtt-template.docx
@@ -4933,20 +4933,8 @@
           <w:sz w:val="20"/>
           <w:szCs w:val="20"/>
         </w:rPr>
-        <w:t xml:space="preserve">LEMBAGA PENDIDIKAN MA’ARIF </w:t>
+        <w:t>LEMBAGA PENDIDIKAN MA’ARIF N</w:t>
       </w:r>
-    </w:p>
-    <w:p>
-      <w:pPr>
-        <w:spacing w:after="0" w:line="240" w:lineRule="auto"/>
-        <w:jc w:val="center"/>
-        <w:rPr>
-          <w:rFonts w:ascii="Arial Narrow" w:hAnsi="Arial Narrow" w:cs="Times New Roman"/>
-          <w:b/>
-          <w:sz w:val="20"/>
-          <w:szCs w:val="20"/>
-        </w:rPr>
-      </w:pPr>
       <w:r>
         <w:rPr>
           <w:rFonts w:ascii="Arial Narrow" w:hAnsi="Arial Narrow" w:cs="Times New Roman"/>
@@ -4954,7 +4942,16 @@
           <w:sz w:val="20"/>
           <w:szCs w:val="20"/>
         </w:rPr>
-        <w:t>KABUPATEN CILACAP</w:t>
+        <w:t>U</w:t>
+      </w:r>
+      <w:r>
+        <w:rPr>
+          <w:rFonts w:ascii="Arial Narrow" w:hAnsi="Arial Narrow" w:cs="Times New Roman"/>
+          <w:b/>
+          <w:sz w:val="20"/>
+          <w:szCs w:val="20"/>
+        </w:rPr>
+        <w:t xml:space="preserve"> CILACAP</w:t>
       </w:r>
     </w:p>
     <w:p>

</xml_diff>

<commit_message>
fix(jenjang): add RA/TK/PAUD detection to populate jenjang command
</commit_message>
<xml_diff>
--- a/public/templates/sk-gtt-template.docx
+++ b/public/templates/sk-gtt-template.docx
@@ -4601,7 +4601,27 @@
                 <w:szCs w:val="20"/>
                 <w:lang w:eastAsia="ko-KR"/>
               </w:rPr>
-              <w:t>LP.Ma'arif NU Cilacap pada</w:t>
+              <w:t>LP.</w:t>
+            </w:r>
+            <w:r>
+              <w:rPr>
+                <w:rFonts w:ascii="Arial Narrow" w:eastAsia="Times New Roman" w:hAnsi="Arial Narrow" w:cs="Calibri"/>
+                <w:color w:val="000000"/>
+                <w:sz w:val="20"/>
+                <w:szCs w:val="20"/>
+                <w:lang w:eastAsia="ko-KR"/>
+              </w:rPr>
+              <w:t xml:space="preserve"> </w:t>
+            </w:r>
+            <w:r>
+              <w:rPr>
+                <w:rFonts w:ascii="Arial Narrow" w:eastAsia="Times New Roman" w:hAnsi="Arial Narrow" w:cs="Calibri"/>
+                <w:color w:val="000000"/>
+                <w:sz w:val="20"/>
+                <w:szCs w:val="20"/>
+                <w:lang w:eastAsia="ko-KR"/>
+              </w:rPr>
+              <w:t>Ma'arif NU Cilacap pada</w:t>
             </w:r>
             <w:r>
               <w:rPr>
@@ -5285,6 +5305,17 @@
           <w:szCs w:val="20"/>
           <w:u w:val="single"/>
         </w:rPr>
+        <w:t xml:space="preserve">H. </w:t>
+      </w:r>
+      <w:r>
+        <w:rPr>
+          <w:rFonts w:ascii="Arial Narrow" w:hAnsi="Arial Narrow" w:cs="Times New Roman"/>
+          <w:b/>
+          <w:bCs/>
+          <w:sz w:val="20"/>
+          <w:szCs w:val="20"/>
+          <w:u w:val="single"/>
+        </w:rPr>
         <w:t>ALI SODIQIN, S.Ag., M.Pd.I</w:t>
       </w:r>
       <w:r>
@@ -5782,6 +5813,7 @@
       </w:rPr>
       <w:t xml:space="preserve"> I/36 </w:t>
     </w:r>
+    <w:proofErr w:type="spellStart"/>
     <w:r>
       <w:rPr>
         <w:rFonts w:ascii="Arial Narrow" w:hAnsi="Arial Narrow"/>
@@ -5790,7 +5822,40 @@
         <w:szCs w:val="20"/>
         <w:lang w:val="en-US"/>
       </w:rPr>
-      <w:t>Kel.Sidanegara Kec. C</w:t>
+      <w:t>Kel.Sidanegara</w:t>
+    </w:r>
+    <w:proofErr w:type="spellEnd"/>
+    <w:r>
+      <w:rPr>
+        <w:rFonts w:ascii="Arial Narrow" w:hAnsi="Arial Narrow"/>
+        <w:color w:val="000000" w:themeColor="text1"/>
+        <w:sz w:val="20"/>
+        <w:szCs w:val="20"/>
+        <w:lang w:val="en-US"/>
+      </w:rPr>
+      <w:t xml:space="preserve"> </w:t>
+    </w:r>
+    <w:proofErr w:type="spellStart"/>
+    <w:r>
+      <w:rPr>
+        <w:rFonts w:ascii="Arial Narrow" w:hAnsi="Arial Narrow"/>
+        <w:color w:val="000000" w:themeColor="text1"/>
+        <w:sz w:val="20"/>
+        <w:szCs w:val="20"/>
+        <w:lang w:val="en-US"/>
+      </w:rPr>
+      <w:t>Kec</w:t>
+    </w:r>
+    <w:proofErr w:type="spellEnd"/>
+    <w:r>
+      <w:rPr>
+        <w:rFonts w:ascii="Arial Narrow" w:hAnsi="Arial Narrow"/>
+        <w:color w:val="000000" w:themeColor="text1"/>
+        <w:sz w:val="20"/>
+        <w:szCs w:val="20"/>
+        <w:lang w:val="en-US"/>
+      </w:rPr>
+      <w:t>. C</w:t>
     </w:r>
     <w:r>
       <w:rPr>
@@ -5809,7 +5874,29 @@
         <w:szCs w:val="20"/>
         <w:lang w:val="en-US"/>
       </w:rPr>
-      <w:t xml:space="preserve"> Tengah kab. Cilacap</w:t>
+      <w:t xml:space="preserve"> Tengah </w:t>
+    </w:r>
+    <w:proofErr w:type="spellStart"/>
+    <w:r>
+      <w:rPr>
+        <w:rFonts w:ascii="Arial Narrow" w:hAnsi="Arial Narrow"/>
+        <w:color w:val="000000" w:themeColor="text1"/>
+        <w:sz w:val="20"/>
+        <w:szCs w:val="20"/>
+        <w:lang w:val="en-US"/>
+      </w:rPr>
+      <w:t>kab</w:t>
+    </w:r>
+    <w:proofErr w:type="spellEnd"/>
+    <w:r>
+      <w:rPr>
+        <w:rFonts w:ascii="Arial Narrow" w:hAnsi="Arial Narrow"/>
+        <w:color w:val="000000" w:themeColor="text1"/>
+        <w:sz w:val="20"/>
+        <w:szCs w:val="20"/>
+        <w:lang w:val="en-US"/>
+      </w:rPr>
+      <w:t>. Cilacap</w:t>
     </w:r>
     <w:r>
       <w:rPr>
@@ -6089,7 +6176,51 @@
         <w:szCs w:val="20"/>
         <w:lang w:val="en-US"/>
       </w:rPr>
-      <w:t>P Ma’arif NU Cilacap               Ma’arif NU Cilacap</w:t>
+      <w:t xml:space="preserve">P </w:t>
+    </w:r>
+    <w:proofErr w:type="spellStart"/>
+    <w:r>
+      <w:rPr>
+        <w:rFonts w:ascii="Arial Narrow" w:hAnsi="Arial Narrow"/>
+        <w:color w:val="000000" w:themeColor="text1"/>
+        <w:sz w:val="20"/>
+        <w:szCs w:val="20"/>
+        <w:lang w:val="en-US"/>
+      </w:rPr>
+      <w:t>Ma’arif</w:t>
+    </w:r>
+    <w:proofErr w:type="spellEnd"/>
+    <w:r>
+      <w:rPr>
+        <w:rFonts w:ascii="Arial Narrow" w:hAnsi="Arial Narrow"/>
+        <w:color w:val="000000" w:themeColor="text1"/>
+        <w:sz w:val="20"/>
+        <w:szCs w:val="20"/>
+        <w:lang w:val="en-US"/>
+      </w:rPr>
+      <w:t xml:space="preserve"> NU Cilacap               </w:t>
+    </w:r>
+    <w:proofErr w:type="spellStart"/>
+    <w:r>
+      <w:rPr>
+        <w:rFonts w:ascii="Arial Narrow" w:hAnsi="Arial Narrow"/>
+        <w:color w:val="000000" w:themeColor="text1"/>
+        <w:sz w:val="20"/>
+        <w:szCs w:val="20"/>
+        <w:lang w:val="en-US"/>
+      </w:rPr>
+      <w:t>Ma’arif</w:t>
+    </w:r>
+    <w:proofErr w:type="spellEnd"/>
+    <w:r>
+      <w:rPr>
+        <w:rFonts w:ascii="Arial Narrow" w:hAnsi="Arial Narrow"/>
+        <w:color w:val="000000" w:themeColor="text1"/>
+        <w:sz w:val="20"/>
+        <w:szCs w:val="20"/>
+        <w:lang w:val="en-US"/>
+      </w:rPr>
+      <w:t xml:space="preserve"> NU Cilacap</w:t>
     </w:r>
   </w:p>
   <w:p>

</xml_diff>

<commit_message>
fix(sk): update docx templates to use dynamic KATA_PENGANGKATAN placeholder
</commit_message>
<xml_diff>
--- a/public/templates/sk-gtt-template.docx
+++ b/public/templates/sk-gtt-template.docx
@@ -4490,7 +4490,7 @@
                 <w:szCs w:val="20"/>
                 <w:lang w:eastAsia="ko-KR"/>
               </w:rPr>
-              <w:t>diangkat</w:t>
+              <w:t>{KATA_PENGANGKATAN}</w:t>
             </w:r>
             <w:r>
               <w:rPr>
@@ -4501,26 +4501,6 @@
                 <w:lang w:eastAsia="ko-KR"/>
               </w:rPr>
               <w:t xml:space="preserve"> </w:t>
-            </w:r>
-            <w:r>
-              <w:rPr>
-                <w:rFonts w:ascii="Arial Narrow" w:eastAsia="Times New Roman" w:hAnsi="Arial Narrow" w:cs="Calibri"/>
-                <w:color w:val="000000"/>
-                <w:sz w:val="20"/>
-                <w:szCs w:val="20"/>
-                <w:lang w:eastAsia="ko-KR"/>
-              </w:rPr>
-              <w:t xml:space="preserve">kembali </w:t>
-            </w:r>
-            <w:r>
-              <w:rPr>
-                <w:rFonts w:ascii="Arial Narrow" w:eastAsia="Times New Roman" w:hAnsi="Arial Narrow" w:cs="Calibri"/>
-                <w:color w:val="000000"/>
-                <w:sz w:val="20"/>
-                <w:szCs w:val="20"/>
-                <w:lang w:eastAsia="ko-KR"/>
-              </w:rPr>
-              <w:t xml:space="preserve">sebagai </w:t>
             </w:r>
             <w:r>
               <w:rPr>

</xml_diff>

<commit_message>
fix: make duplicate cleaner check unit_kerja and migrate school_id
</commit_message>
<xml_diff>
--- a/public/templates/sk-gtt-template.docx
+++ b/public/templates/sk-gtt-template.docx
@@ -4954,6 +4954,277 @@
         <w:t xml:space="preserve"> CILACAP</w:t>
       </w:r>
     </w:p>
+    <w:tbl>
+      <w:tblPr>
+        <w:tblStyle w:val="TableGrid"/>
+        <w:tblW w:w="0" w:type="auto"/>
+        <w:tblBorders>
+          <w:top w:val="none" w:sz="0" w:space="0" w:color="auto"/>
+          <w:left w:val="none" w:sz="0" w:space="0" w:color="auto"/>
+          <w:bottom w:val="none" w:sz="0" w:space="0" w:color="auto"/>
+          <w:right w:val="none" w:sz="0" w:space="0" w:color="auto"/>
+          <w:insideH w:val="none" w:sz="0" w:space="0" w:color="auto"/>
+          <w:insideV w:val="none" w:sz="0" w:space="0" w:color="auto"/>
+        </w:tblBorders>
+        <w:tblLook w:val="04A0" w:firstRow="1" w:lastRow="0" w:firstColumn="1" w:lastColumn="0" w:noHBand="0" w:noVBand="1"/>
+      </w:tblPr>
+      <w:tblGrid>
+        <w:gridCol w:w="5378"/>
+        <w:gridCol w:w="5378"/>
+      </w:tblGrid>
+      <w:tr>
+        <w:tc>
+          <w:tcPr>
+            <w:tcW w:w="5378" w:type="dxa"/>
+          </w:tcPr>
+          <w:p>
+            <w:pPr>
+              <w:spacing w:after="0" w:line="240" w:lineRule="auto"/>
+              <w:jc w:val="center"/>
+              <w:rPr>
+                <w:rFonts w:ascii="Arial Narrow" w:hAnsi="Arial Narrow" w:cs="Times New Roman"/>
+                <w:b/>
+                <w:bCs/>
+                <w:sz w:val="20"/>
+                <w:szCs w:val="20"/>
+                <w:u w:val="single"/>
+              </w:rPr>
+            </w:pPr>
+          </w:p>
+          <w:p>
+            <w:pPr>
+              <w:spacing w:after="0" w:line="240" w:lineRule="auto"/>
+              <w:jc w:val="center"/>
+              <w:rPr>
+                <w:rFonts w:ascii="Arial Narrow" w:hAnsi="Arial Narrow" w:cs="Times New Roman"/>
+                <w:b/>
+                <w:bCs/>
+                <w:sz w:val="20"/>
+                <w:szCs w:val="20"/>
+                <w:u w:val="single"/>
+              </w:rPr>
+            </w:pPr>
+          </w:p>
+          <w:p>
+            <w:pPr>
+              <w:spacing w:after="0" w:line="240" w:lineRule="auto"/>
+              <w:jc w:val="center"/>
+              <w:rPr>
+                <w:rFonts w:ascii="Arial Narrow" w:hAnsi="Arial Narrow" w:cs="Times New Roman"/>
+                <w:b/>
+                <w:bCs/>
+                <w:sz w:val="20"/>
+                <w:szCs w:val="20"/>
+                <w:u w:val="single"/>
+              </w:rPr>
+            </w:pPr>
+          </w:p>
+          <w:p>
+            <w:pPr>
+              <w:spacing w:after="0" w:line="240" w:lineRule="auto"/>
+              <w:jc w:val="center"/>
+              <w:rPr>
+                <w:rFonts w:ascii="Arial Narrow" w:hAnsi="Arial Narrow" w:cs="Times New Roman"/>
+                <w:b/>
+                <w:bCs/>
+                <w:sz w:val="20"/>
+                <w:szCs w:val="20"/>
+                <w:u w:val="single"/>
+              </w:rPr>
+            </w:pPr>
+          </w:p>
+          <w:p>
+            <w:pPr>
+              <w:spacing w:after="0" w:line="240" w:lineRule="auto"/>
+              <w:jc w:val="center"/>
+              <w:rPr>
+                <w:rFonts w:ascii="Arial Narrow" w:hAnsi="Arial Narrow" w:cs="Times New Roman"/>
+                <w:b/>
+                <w:bCs/>
+                <w:sz w:val="20"/>
+                <w:szCs w:val="20"/>
+                <w:u w:val="single"/>
+              </w:rPr>
+            </w:pPr>
+          </w:p>
+          <w:p>
+            <w:pPr>
+              <w:spacing w:after="0" w:line="240" w:lineRule="auto"/>
+              <w:jc w:val="center"/>
+              <w:rPr>
+                <w:rFonts w:ascii="Arial Narrow" w:hAnsi="Arial Narrow" w:cs="Times New Roman"/>
+                <w:b/>
+                <w:bCs/>
+                <w:sz w:val="20"/>
+                <w:szCs w:val="20"/>
+                <w:u w:val="single"/>
+              </w:rPr>
+            </w:pPr>
+            <w:r>
+              <w:rPr>
+                <w:rFonts w:ascii="Arial Narrow" w:hAnsi="Arial Narrow" w:cs="Times New Roman"/>
+                <w:b/>
+                <w:bCs/>
+                <w:sz w:val="20"/>
+                <w:szCs w:val="20"/>
+                <w:u w:val="single"/>
+              </w:rPr>
+              <w:t>H. ALI SODIQIN, S.Ag., M.Pd.I</w:t>
+            </w:r>
+          </w:p>
+          <w:p>
+            <w:pPr>
+              <w:spacing w:after="0" w:line="240" w:lineRule="auto"/>
+              <w:jc w:val="center"/>
+              <w:rPr>
+                <w:rFonts w:ascii="Arial Narrow" w:hAnsi="Arial Narrow" w:cs="Times New Roman"/>
+                <w:b/>
+                <w:i/>
+                <w:iCs/>
+                <w:sz w:val="20"/>
+                <w:szCs w:val="20"/>
+              </w:rPr>
+            </w:pPr>
+            <w:r>
+              <w:rPr>
+                <w:rFonts w:ascii="Arial Narrow" w:hAnsi="Arial Narrow" w:cs="Times New Roman"/>
+                <w:b/>
+                <w:i/>
+                <w:iCs/>
+                <w:sz w:val="20"/>
+                <w:szCs w:val="20"/>
+              </w:rPr>
+              <w:t>Ketua</w:t>
+            </w:r>
+          </w:p>
+        </w:tc>
+        <w:tc>
+          <w:tcPr>
+            <w:tcW w:w="5378" w:type="dxa"/>
+          </w:tcPr>
+          <w:p>
+            <w:pPr>
+              <w:spacing w:after="0" w:line="240" w:lineRule="auto"/>
+              <w:jc w:val="center"/>
+              <w:rPr>
+                <w:rFonts w:ascii="Arial Narrow" w:hAnsi="Arial Narrow" w:cs="Times New Roman"/>
+                <w:b/>
+                <w:bCs/>
+                <w:sz w:val="20"/>
+                <w:szCs w:val="20"/>
+                <w:u w:val="single"/>
+              </w:rPr>
+            </w:pPr>
+          </w:p>
+          <w:p>
+            <w:pPr>
+              <w:spacing w:after="0" w:line="240" w:lineRule="auto"/>
+              <w:jc w:val="center"/>
+              <w:rPr>
+                <w:rFonts w:ascii="Arial Narrow" w:hAnsi="Arial Narrow" w:cs="Times New Roman"/>
+                <w:b/>
+                <w:bCs/>
+                <w:sz w:val="20"/>
+                <w:szCs w:val="20"/>
+                <w:u w:val="single"/>
+              </w:rPr>
+            </w:pPr>
+          </w:p>
+          <w:p>
+            <w:pPr>
+              <w:spacing w:after="0" w:line="240" w:lineRule="auto"/>
+              <w:jc w:val="center"/>
+              <w:rPr>
+                <w:rFonts w:ascii="Arial Narrow" w:hAnsi="Arial Narrow" w:cs="Times New Roman"/>
+                <w:b/>
+                <w:bCs/>
+                <w:sz w:val="20"/>
+                <w:szCs w:val="20"/>
+                <w:u w:val="single"/>
+              </w:rPr>
+            </w:pPr>
+          </w:p>
+          <w:p>
+            <w:pPr>
+              <w:spacing w:after="0" w:line="240" w:lineRule="auto"/>
+              <w:jc w:val="center"/>
+              <w:rPr>
+                <w:rFonts w:ascii="Arial Narrow" w:hAnsi="Arial Narrow" w:cs="Times New Roman"/>
+                <w:b/>
+                <w:bCs/>
+                <w:sz w:val="20"/>
+                <w:szCs w:val="20"/>
+                <w:u w:val="single"/>
+              </w:rPr>
+            </w:pPr>
+          </w:p>
+          <w:p>
+            <w:pPr>
+              <w:spacing w:after="0" w:line="240" w:lineRule="auto"/>
+              <w:jc w:val="center"/>
+              <w:rPr>
+                <w:rFonts w:ascii="Arial Narrow" w:hAnsi="Arial Narrow" w:cs="Times New Roman"/>
+                <w:b/>
+                <w:bCs/>
+                <w:sz w:val="20"/>
+                <w:szCs w:val="20"/>
+                <w:u w:val="single"/>
+              </w:rPr>
+            </w:pPr>
+          </w:p>
+          <w:p>
+            <w:pPr>
+              <w:spacing w:after="0" w:line="240" w:lineRule="auto"/>
+              <w:jc w:val="center"/>
+              <w:rPr>
+                <w:rFonts w:ascii="Arial Narrow" w:hAnsi="Arial Narrow" w:cs="Times New Roman"/>
+                <w:b/>
+                <w:bCs/>
+                <w:sz w:val="20"/>
+                <w:szCs w:val="20"/>
+                <w:u w:val="single"/>
+              </w:rPr>
+            </w:pPr>
+            <w:r>
+              <w:rPr>
+                <w:rFonts w:ascii="Arial Narrow" w:hAnsi="Arial Narrow" w:cs="Times New Roman"/>
+                <w:b/>
+                <w:bCs/>
+                <w:sz w:val="20"/>
+                <w:szCs w:val="20"/>
+                <w:u w:val="single"/>
+              </w:rPr>
+              <w:t>NGADINO, S.Pd.I</w:t>
+            </w:r>
+          </w:p>
+          <w:p>
+            <w:pPr>
+              <w:spacing w:after="0" w:line="240" w:lineRule="auto"/>
+              <w:jc w:val="center"/>
+              <w:rPr>
+                <w:rFonts w:ascii="Arial Narrow" w:hAnsi="Arial Narrow" w:cs="Times New Roman"/>
+                <w:b/>
+                <w:i/>
+                <w:iCs/>
+                <w:sz w:val="20"/>
+                <w:szCs w:val="20"/>
+              </w:rPr>
+            </w:pPr>
+            <w:r>
+              <w:rPr>
+                <w:rFonts w:ascii="Arial Narrow" w:hAnsi="Arial Narrow" w:cs="Times New Roman"/>
+                <w:b/>
+                <w:i/>
+                <w:iCs/>
+                <w:sz w:val="20"/>
+                <w:szCs w:val="20"/>
+              </w:rPr>
+              <w:t>Sekretaris</w:t>
+            </w:r>
+          </w:p>
+        </w:tc>
+      </w:tr>
+    </w:tbl>
     <w:p>
       <w:pPr>
         <w:spacing w:after="0" w:line="240" w:lineRule="auto"/>
@@ -4961,499 +5232,6 @@
         <w:rPr>
           <w:rFonts w:ascii="Arial Narrow" w:hAnsi="Arial Narrow" w:cs="Times New Roman"/>
           <w:b/>
-          <w:sz w:val="20"/>
-          <w:szCs w:val="20"/>
-        </w:rPr>
-      </w:pPr>
-    </w:p>
-    <w:p>
-      <w:pPr>
-        <w:spacing w:after="0" w:line="240" w:lineRule="auto"/>
-        <w:jc w:val="center"/>
-        <w:rPr>
-          <w:rFonts w:ascii="Arial Narrow" w:hAnsi="Arial Narrow" w:cs="Times New Roman"/>
-          <w:b/>
-          <w:noProof/>
-          <w:sz w:val="20"/>
-          <w:szCs w:val="20"/>
-        </w:rPr>
-      </w:pPr>
-    </w:p>
-    <w:p>
-      <w:pPr>
-        <w:spacing w:after="0" w:line="240" w:lineRule="auto"/>
-        <w:jc w:val="center"/>
-        <w:rPr>
-          <w:rFonts w:ascii="Arial Narrow" w:hAnsi="Arial Narrow" w:cs="Times New Roman"/>
-          <w:b/>
-          <w:sz w:val="20"/>
-          <w:szCs w:val="20"/>
-        </w:rPr>
-      </w:pPr>
-    </w:p>
-    <w:p>
-      <w:pPr>
-        <w:spacing w:after="0" w:line="240" w:lineRule="auto"/>
-        <w:rPr>
-          <w:rFonts w:ascii="Arial Narrow" w:hAnsi="Arial Narrow" w:cs="Times New Roman"/>
-          <w:b/>
-          <w:sz w:val="20"/>
-          <w:szCs w:val="20"/>
-        </w:rPr>
-      </w:pPr>
-      <w:r>
-        <w:rPr>
-          <w:rFonts w:ascii="Arial Narrow" w:hAnsi="Arial Narrow" w:cs="Times New Roman"/>
-          <w:b/>
-          <w:noProof/>
-          <w:sz w:val="20"/>
-          <w:szCs w:val="20"/>
-          <w:lang w:val="en-US"/>
-        </w:rPr>
-        <w:drawing>
-          <wp:anchor distT="0" distB="0" distL="114300" distR="114300" simplePos="0" relativeHeight="251646976" behindDoc="1" locked="0" layoutInCell="1" allowOverlap="1" wp14:anchorId="57762938" wp14:editId="6B1840C7">
-            <wp:simplePos x="0" y="0"/>
-            <wp:positionH relativeFrom="column">
-              <wp:posOffset>4650740</wp:posOffset>
-            </wp:positionH>
-            <wp:positionV relativeFrom="paragraph">
-              <wp:posOffset>9467850</wp:posOffset>
-            </wp:positionV>
-            <wp:extent cx="1805305" cy="506730"/>
-            <wp:effectExtent l="19050" t="0" r="4445" b="0"/>
-            <wp:wrapNone/>
-            <wp:docPr id="4" name="Picture 4" descr="TOPIKK"/>
-            <wp:cNvGraphicFramePr>
-              <a:graphicFrameLocks xmlns:a="http://schemas.openxmlformats.org/drawingml/2006/main" noChangeAspect="1"/>
-            </wp:cNvGraphicFramePr>
-            <a:graphic xmlns:a="http://schemas.openxmlformats.org/drawingml/2006/main">
-              <a:graphicData uri="http://schemas.openxmlformats.org/drawingml/2006/picture">
-                <pic:pic xmlns:pic="http://schemas.openxmlformats.org/drawingml/2006/picture">
-                  <pic:nvPicPr>
-                    <pic:cNvPr id="0" name="Picture 4" descr="TOPIKK"/>
-                    <pic:cNvPicPr>
-                      <a:picLocks noChangeAspect="1" noChangeArrowheads="1"/>
-                    </pic:cNvPicPr>
-                  </pic:nvPicPr>
-                  <pic:blipFill>
-                    <a:blip r:embed="rId8" cstate="print"/>
-                    <a:srcRect/>
-                    <a:stretch>
-                      <a:fillRect/>
-                    </a:stretch>
-                  </pic:blipFill>
-                  <pic:spPr bwMode="auto">
-                    <a:xfrm>
-                      <a:off x="0" y="0"/>
-                      <a:ext cx="1805305" cy="506730"/>
-                    </a:xfrm>
-                    <a:prstGeom prst="rect">
-                      <a:avLst/>
-                    </a:prstGeom>
-                    <a:noFill/>
-                    <a:ln w="9525">
-                      <a:noFill/>
-                      <a:miter lim="800000"/>
-                      <a:headEnd/>
-                      <a:tailEnd/>
-                    </a:ln>
-                  </pic:spPr>
-                </pic:pic>
-              </a:graphicData>
-            </a:graphic>
-          </wp:anchor>
-        </w:drawing>
-      </w:r>
-    </w:p>
-    <w:p>
-      <w:pPr>
-        <w:spacing w:after="0" w:line="240" w:lineRule="auto"/>
-        <w:ind w:left="1440" w:firstLine="720"/>
-        <w:rPr>
-          <w:rFonts w:ascii="Arial Narrow" w:hAnsi="Arial Narrow" w:cs="Times New Roman"/>
-          <w:b/>
-          <w:bCs/>
-          <w:sz w:val="20"/>
-          <w:szCs w:val="20"/>
-        </w:rPr>
-      </w:pPr>
-      <w:r>
-        <w:rPr>
-          <w:rFonts w:ascii="Arial Narrow" w:hAnsi="Arial Narrow" w:cs="Times New Roman"/>
-          <w:b/>
-          <w:bCs/>
-          <w:noProof/>
-          <w:sz w:val="20"/>
-          <w:szCs w:val="20"/>
-          <w:u w:val="single"/>
-          <w:lang w:val="en-US"/>
-        </w:rPr>
-        <w:drawing>
-          <wp:anchor distT="0" distB="0" distL="114300" distR="114300" simplePos="0" relativeHeight="251657216" behindDoc="1" locked="0" layoutInCell="1" allowOverlap="1" wp14:anchorId="6B1D7B51" wp14:editId="6510C0CB">
-            <wp:simplePos x="0" y="0"/>
-            <wp:positionH relativeFrom="column">
-              <wp:posOffset>1739900</wp:posOffset>
-            </wp:positionH>
-            <wp:positionV relativeFrom="paragraph">
-              <wp:posOffset>8971915</wp:posOffset>
-            </wp:positionV>
-            <wp:extent cx="1047750" cy="981075"/>
-            <wp:effectExtent l="76200" t="57150" r="57150" b="47625"/>
-            <wp:wrapNone/>
-            <wp:docPr id="3" name="Picture 0" descr="kakine.jpg"/>
-            <wp:cNvGraphicFramePr>
-              <a:graphicFrameLocks xmlns:a="http://schemas.openxmlformats.org/drawingml/2006/main" noChangeAspect="1"/>
-            </wp:cNvGraphicFramePr>
-            <a:graphic xmlns:a="http://schemas.openxmlformats.org/drawingml/2006/main">
-              <a:graphicData uri="http://schemas.openxmlformats.org/drawingml/2006/picture">
-                <pic:pic xmlns:pic="http://schemas.openxmlformats.org/drawingml/2006/picture">
-                  <pic:nvPicPr>
-                    <pic:cNvPr id="0" name="Picture 0" descr="kakine.jpg"/>
-                    <pic:cNvPicPr>
-                      <a:picLocks noChangeAspect="1" noChangeArrowheads="1"/>
-                    </pic:cNvPicPr>
-                  </pic:nvPicPr>
-                  <pic:blipFill>
-                    <a:blip r:embed="rId9" cstate="print">
-                      <a:lum bright="-50000" contrast="70000"/>
-                    </a:blip>
-                    <a:srcRect/>
-                    <a:stretch>
-                      <a:fillRect/>
-                    </a:stretch>
-                  </pic:blipFill>
-                  <pic:spPr bwMode="auto">
-                    <a:xfrm rot="-418683">
-                      <a:off x="0" y="0"/>
-                      <a:ext cx="1047750" cy="981075"/>
-                    </a:xfrm>
-                    <a:prstGeom prst="rect">
-                      <a:avLst/>
-                    </a:prstGeom>
-                    <a:noFill/>
-                    <a:ln w="9525">
-                      <a:noFill/>
-                      <a:miter lim="800000"/>
-                      <a:headEnd/>
-                      <a:tailEnd/>
-                    </a:ln>
-                  </pic:spPr>
-                </pic:pic>
-              </a:graphicData>
-            </a:graphic>
-          </wp:anchor>
-        </w:drawing>
-      </w:r>
-      <w:r>
-        <w:rPr>
-          <w:rFonts w:ascii="Arial Narrow" w:hAnsi="Arial Narrow" w:cs="Times New Roman"/>
-          <w:b/>
-          <w:bCs/>
-          <w:noProof/>
-          <w:sz w:val="20"/>
-          <w:szCs w:val="20"/>
-          <w:u w:val="single"/>
-          <w:lang w:val="en-US"/>
-        </w:rPr>
-        <w:drawing>
-          <wp:anchor distT="0" distB="0" distL="114300" distR="114300" simplePos="0" relativeHeight="251677696" behindDoc="1" locked="0" layoutInCell="1" allowOverlap="1" wp14:anchorId="4EC11B04" wp14:editId="6136382D">
-            <wp:simplePos x="0" y="0"/>
-            <wp:positionH relativeFrom="column">
-              <wp:posOffset>4615180</wp:posOffset>
-            </wp:positionH>
-            <wp:positionV relativeFrom="paragraph">
-              <wp:posOffset>8862695</wp:posOffset>
-            </wp:positionV>
-            <wp:extent cx="1805305" cy="506730"/>
-            <wp:effectExtent l="19050" t="0" r="4445" b="0"/>
-            <wp:wrapNone/>
-            <wp:docPr id="8" name="Picture 8" descr="TOPIKK"/>
-            <wp:cNvGraphicFramePr>
-              <a:graphicFrameLocks xmlns:a="http://schemas.openxmlformats.org/drawingml/2006/main" noChangeAspect="1"/>
-            </wp:cNvGraphicFramePr>
-            <a:graphic xmlns:a="http://schemas.openxmlformats.org/drawingml/2006/main">
-              <a:graphicData uri="http://schemas.openxmlformats.org/drawingml/2006/picture">
-                <pic:pic xmlns:pic="http://schemas.openxmlformats.org/drawingml/2006/picture">
-                  <pic:nvPicPr>
-                    <pic:cNvPr id="0" name="Picture 8" descr="TOPIKK"/>
-                    <pic:cNvPicPr>
-                      <a:picLocks noChangeAspect="1" noChangeArrowheads="1"/>
-                    </pic:cNvPicPr>
-                  </pic:nvPicPr>
-                  <pic:blipFill>
-                    <a:blip r:embed="rId8" cstate="print"/>
-                    <a:srcRect/>
-                    <a:stretch>
-                      <a:fillRect/>
-                    </a:stretch>
-                  </pic:blipFill>
-                  <pic:spPr bwMode="auto">
-                    <a:xfrm>
-                      <a:off x="0" y="0"/>
-                      <a:ext cx="1805305" cy="506730"/>
-                    </a:xfrm>
-                    <a:prstGeom prst="rect">
-                      <a:avLst/>
-                    </a:prstGeom>
-                    <a:noFill/>
-                    <a:ln w="9525">
-                      <a:noFill/>
-                      <a:miter lim="800000"/>
-                      <a:headEnd/>
-                      <a:tailEnd/>
-                    </a:ln>
-                  </pic:spPr>
-                </pic:pic>
-              </a:graphicData>
-            </a:graphic>
-          </wp:anchor>
-        </w:drawing>
-      </w:r>
-      <w:r>
-        <w:rPr>
-          <w:rFonts w:ascii="Arial Narrow" w:hAnsi="Arial Narrow" w:cs="Times New Roman"/>
-          <w:b/>
-          <w:bCs/>
-          <w:noProof/>
-          <w:sz w:val="20"/>
-          <w:szCs w:val="20"/>
-          <w:u w:val="single"/>
-          <w:lang w:val="en-US"/>
-        </w:rPr>
-        <w:drawing>
-          <wp:anchor distT="0" distB="0" distL="114300" distR="114300" simplePos="0" relativeHeight="251667456" behindDoc="1" locked="0" layoutInCell="1" allowOverlap="1" wp14:anchorId="7815FA60" wp14:editId="7E332184">
-            <wp:simplePos x="0" y="0"/>
-            <wp:positionH relativeFrom="column">
-              <wp:posOffset>1828800</wp:posOffset>
-            </wp:positionH>
-            <wp:positionV relativeFrom="paragraph">
-              <wp:posOffset>8571865</wp:posOffset>
-            </wp:positionV>
-            <wp:extent cx="1047750" cy="981075"/>
-            <wp:effectExtent l="76200" t="57150" r="57150" b="47625"/>
-            <wp:wrapNone/>
-            <wp:docPr id="6" name="Picture 0" descr="kakine.jpg"/>
-            <wp:cNvGraphicFramePr>
-              <a:graphicFrameLocks xmlns:a="http://schemas.openxmlformats.org/drawingml/2006/main" noChangeAspect="1"/>
-            </wp:cNvGraphicFramePr>
-            <a:graphic xmlns:a="http://schemas.openxmlformats.org/drawingml/2006/main">
-              <a:graphicData uri="http://schemas.openxmlformats.org/drawingml/2006/picture">
-                <pic:pic xmlns:pic="http://schemas.openxmlformats.org/drawingml/2006/picture">
-                  <pic:nvPicPr>
-                    <pic:cNvPr id="0" name="Picture 0" descr="kakine.jpg"/>
-                    <pic:cNvPicPr>
-                      <a:picLocks noChangeAspect="1" noChangeArrowheads="1"/>
-                    </pic:cNvPicPr>
-                  </pic:nvPicPr>
-                  <pic:blipFill>
-                    <a:blip r:embed="rId9" cstate="print">
-                      <a:lum bright="-50000" contrast="70000"/>
-                    </a:blip>
-                    <a:srcRect/>
-                    <a:stretch>
-                      <a:fillRect/>
-                    </a:stretch>
-                  </pic:blipFill>
-                  <pic:spPr bwMode="auto">
-                    <a:xfrm rot="-418683">
-                      <a:off x="0" y="0"/>
-                      <a:ext cx="1047750" cy="981075"/>
-                    </a:xfrm>
-                    <a:prstGeom prst="rect">
-                      <a:avLst/>
-                    </a:prstGeom>
-                    <a:noFill/>
-                    <a:ln w="9525">
-                      <a:noFill/>
-                      <a:miter lim="800000"/>
-                      <a:headEnd/>
-                      <a:tailEnd/>
-                    </a:ln>
-                  </pic:spPr>
-                </pic:pic>
-              </a:graphicData>
-            </a:graphic>
-          </wp:anchor>
-        </w:drawing>
-      </w:r>
-      <w:r>
-        <w:rPr>
-          <w:rFonts w:ascii="Arial Narrow" w:hAnsi="Arial Narrow" w:cs="Times New Roman"/>
-          <w:b/>
-          <w:bCs/>
-          <w:sz w:val="20"/>
-          <w:szCs w:val="20"/>
-          <w:u w:val="single"/>
-        </w:rPr>
-        <w:t xml:space="preserve">H. </w:t>
-      </w:r>
-      <w:r>
-        <w:rPr>
-          <w:rFonts w:ascii="Arial Narrow" w:hAnsi="Arial Narrow" w:cs="Times New Roman"/>
-          <w:b/>
-          <w:bCs/>
-          <w:sz w:val="20"/>
-          <w:szCs w:val="20"/>
-          <w:u w:val="single"/>
-        </w:rPr>
-        <w:t>ALI SODIQIN, S.Ag., M.Pd.I</w:t>
-      </w:r>
-      <w:r>
-        <w:rPr>
-          <w:rFonts w:ascii="Arial Narrow" w:hAnsi="Arial Narrow" w:cs="Times New Roman"/>
-          <w:b/>
-          <w:bCs/>
-          <w:sz w:val="20"/>
-          <w:szCs w:val="20"/>
-        </w:rPr>
-        <w:tab/>
-      </w:r>
-      <w:r>
-        <w:rPr>
-          <w:rFonts w:ascii="Arial Narrow" w:hAnsi="Arial Narrow" w:cs="Times New Roman"/>
-          <w:b/>
-          <w:bCs/>
-          <w:sz w:val="20"/>
-          <w:szCs w:val="20"/>
-        </w:rPr>
-        <w:tab/>
-      </w:r>
-      <w:r>
-        <w:rPr>
-          <w:rFonts w:ascii="Arial Narrow" w:hAnsi="Arial Narrow" w:cs="Times New Roman"/>
-          <w:b/>
-          <w:bCs/>
-          <w:sz w:val="20"/>
-          <w:szCs w:val="20"/>
-        </w:rPr>
-        <w:tab/>
-      </w:r>
-      <w:r>
-        <w:rPr>
-          <w:rFonts w:ascii="Arial Narrow" w:hAnsi="Arial Narrow" w:cs="Times New Roman"/>
-          <w:b/>
-          <w:bCs/>
-          <w:sz w:val="20"/>
-          <w:szCs w:val="20"/>
-        </w:rPr>
-        <w:tab/>
-      </w:r>
-      <w:r>
-        <w:rPr>
-          <w:rFonts w:ascii="Arial Narrow" w:hAnsi="Arial Narrow" w:cs="Times New Roman"/>
-          <w:b/>
-          <w:bCs/>
-          <w:sz w:val="20"/>
-          <w:szCs w:val="20"/>
-          <w:u w:val="single"/>
-        </w:rPr>
-        <w:t>NGADINO, S.Pd.I</w:t>
-      </w:r>
-    </w:p>
-    <w:p>
-      <w:pPr>
-        <w:spacing w:after="0" w:line="240" w:lineRule="auto"/>
-        <w:ind w:left="2160" w:firstLine="720"/>
-        <w:rPr>
-          <w:rFonts w:ascii="Arial Narrow" w:hAnsi="Arial Narrow" w:cs="Times New Roman"/>
-          <w:b/>
-          <w:bCs/>
-          <w:sz w:val="20"/>
-          <w:szCs w:val="20"/>
-        </w:rPr>
-      </w:pPr>
-      <w:r>
-        <w:rPr>
-          <w:rFonts w:ascii="Arial Narrow" w:hAnsi="Arial Narrow" w:cs="Times New Roman"/>
-          <w:b/>
-          <w:bCs/>
-          <w:i/>
-          <w:iCs/>
-          <w:sz w:val="20"/>
-          <w:szCs w:val="20"/>
-        </w:rPr>
-        <w:t xml:space="preserve">Ketua </w:t>
-      </w:r>
-      <w:r>
-        <w:rPr>
-          <w:rFonts w:ascii="Arial Narrow" w:hAnsi="Arial Narrow" w:cs="Times New Roman"/>
-          <w:b/>
-          <w:bCs/>
-          <w:i/>
-          <w:iCs/>
-          <w:sz w:val="20"/>
-          <w:szCs w:val="20"/>
-        </w:rPr>
-        <w:tab/>
-      </w:r>
-      <w:r>
-        <w:rPr>
-          <w:rFonts w:ascii="Arial Narrow" w:hAnsi="Arial Narrow" w:cs="Times New Roman"/>
-          <w:b/>
-          <w:bCs/>
-          <w:i/>
-          <w:iCs/>
-          <w:sz w:val="20"/>
-          <w:szCs w:val="20"/>
-        </w:rPr>
-        <w:tab/>
-      </w:r>
-      <w:r>
-        <w:rPr>
-          <w:rFonts w:ascii="Arial Narrow" w:hAnsi="Arial Narrow" w:cs="Times New Roman"/>
-          <w:b/>
-          <w:bCs/>
-          <w:i/>
-          <w:iCs/>
-          <w:sz w:val="20"/>
-          <w:szCs w:val="20"/>
-        </w:rPr>
-        <w:tab/>
-        <w:t xml:space="preserve">  </w:t>
-      </w:r>
-      <w:r>
-        <w:rPr>
-          <w:rFonts w:ascii="Arial Narrow" w:hAnsi="Arial Narrow" w:cs="Times New Roman"/>
-          <w:b/>
-          <w:bCs/>
-          <w:i/>
-          <w:iCs/>
-          <w:sz w:val="20"/>
-          <w:szCs w:val="20"/>
-        </w:rPr>
-        <w:tab/>
-        <w:t xml:space="preserve">    </w:t>
-      </w:r>
-      <w:r>
-        <w:rPr>
-          <w:rFonts w:ascii="Arial Narrow" w:hAnsi="Arial Narrow" w:cs="Times New Roman"/>
-          <w:b/>
-          <w:bCs/>
-          <w:i/>
-          <w:iCs/>
-          <w:sz w:val="20"/>
-          <w:szCs w:val="20"/>
-        </w:rPr>
-        <w:tab/>
-      </w:r>
-      <w:r>
-        <w:rPr>
-          <w:rFonts w:ascii="Arial Narrow" w:hAnsi="Arial Narrow" w:cs="Times New Roman"/>
-          <w:b/>
-          <w:bCs/>
-          <w:i/>
-          <w:iCs/>
-          <w:sz w:val="20"/>
-          <w:szCs w:val="20"/>
-        </w:rPr>
-        <w:t xml:space="preserve">     Sekretaris</w:t>
-      </w:r>
-    </w:p>
-    <w:p>
-      <w:pPr>
-        <w:spacing w:after="0" w:line="240" w:lineRule="auto"/>
-        <w:rPr>
-          <w:rFonts w:ascii="Arial Narrow" w:hAnsi="Arial Narrow" w:cs="Times New Roman"/>
           <w:sz w:val="20"/>
           <w:szCs w:val="20"/>
         </w:rPr>
@@ -5494,6 +5272,69 @@
             <w:r>
               <w:rPr>
                 <w:rFonts w:ascii="Arial Narrow" w:hAnsi="Arial Narrow" w:cs="Times New Roman"/>
+                <w:b/>
+                <w:noProof/>
+                <w:sz w:val="20"/>
+                <w:szCs w:val="20"/>
+                <w:lang w:val="en-US"/>
+              </w:rPr>
+              <w:drawing>
+                <wp:anchor distT="0" distB="0" distL="114300" distR="114300" simplePos="0" relativeHeight="251646976" behindDoc="1" locked="0" layoutInCell="1" allowOverlap="1" wp14:anchorId="57762938" wp14:editId="6B1840C7">
+                  <wp:simplePos x="0" y="0"/>
+                  <wp:positionH relativeFrom="column">
+                    <wp:posOffset>4650740</wp:posOffset>
+                  </wp:positionH>
+                  <wp:positionV relativeFrom="paragraph">
+                    <wp:posOffset>9467850</wp:posOffset>
+                  </wp:positionV>
+                  <wp:extent cx="1805305" cy="506730"/>
+                  <wp:effectExtent l="19050" t="0" r="4445" b="0"/>
+                  <wp:wrapNone/>
+                  <wp:docPr id="4" name="Picture 4" descr="TOPIKK"/>
+                  <wp:cNvGraphicFramePr>
+                    <a:graphicFrameLocks xmlns:a="http://schemas.openxmlformats.org/drawingml/2006/main" noChangeAspect="1"/>
+                  </wp:cNvGraphicFramePr>
+                  <a:graphic xmlns:a="http://schemas.openxmlformats.org/drawingml/2006/main">
+                    <a:graphicData uri="http://schemas.openxmlformats.org/drawingml/2006/picture">
+                      <pic:pic xmlns:pic="http://schemas.openxmlformats.org/drawingml/2006/picture">
+                        <pic:nvPicPr>
+                          <pic:cNvPr id="0" name="Picture 4" descr="TOPIKK"/>
+                          <pic:cNvPicPr>
+                            <a:picLocks noChangeAspect="1" noChangeArrowheads="1"/>
+                          </pic:cNvPicPr>
+                        </pic:nvPicPr>
+                        <pic:blipFill>
+                          <a:blip r:embed="rId8" cstate="print"/>
+                          <a:srcRect/>
+                          <a:stretch>
+                            <a:fillRect/>
+                          </a:stretch>
+                        </pic:blipFill>
+                        <pic:spPr bwMode="auto">
+                          <a:xfrm>
+                            <a:off x="0" y="0"/>
+                            <a:ext cx="1805305" cy="506730"/>
+                          </a:xfrm>
+                          <a:prstGeom prst="rect">
+                            <a:avLst/>
+                          </a:prstGeom>
+                          <a:noFill/>
+                          <a:ln w="9525">
+                            <a:noFill/>
+                            <a:miter lim="800000"/>
+                            <a:headEnd/>
+                            <a:tailEnd/>
+                          </a:ln>
+                        </pic:spPr>
+                      </pic:pic>
+                    </a:graphicData>
+                  </a:graphic>
+                </wp:anchor>
+              </w:drawing>
+            </w:r>
+            <w:r>
+              <w:rPr>
+                <w:rFonts w:ascii="Arial Narrow" w:hAnsi="Arial Narrow" w:cs="Times New Roman"/>
                 <w:sz w:val="20"/>
                 <w:szCs w:val="20"/>
               </w:rPr>
@@ -5588,7 +5429,7 @@
       </w:pPr>
     </w:p>
     <w:sectPr>
-      <w:headerReference w:type="default" r:id="rId10"/>
+      <w:headerReference w:type="default" r:id="rId9"/>
       <w:pgSz w:w="12242" w:h="20163"/>
       <w:pgMar w:top="1440" w:right="851" w:bottom="1440" w:left="851" w:header="624" w:footer="709" w:gutter="0"/>
       <w:cols w:space="708"/>

</xml_diff>